<commit_message>
Part 3: data flow
</commit_message>
<xml_diff>
--- a/Lab6_AbdanurAyazbek_BDA2406.docx
+++ b/Lab6_AbdanurAyazbek_BDA2406.docx
@@ -11203,29 +11203,65 @@
     <w:p>
       <w:pPr>
         <w:pStyle w:val="a3"/>
-        <w:sectPr>
-          <w:pgSz w:w="11910" w:h="16840"/>
-          <w:pgMar w:top="1440" w:right="1133" w:bottom="860" w:left="850" w:header="0" w:footer="630" w:gutter="0"/>
-          <w:cols w:space="720"/>
-        </w:sectPr>
-      </w:pPr>
-    </w:p>
-    <w:p>
-      <w:pPr>
-        <w:spacing w:before="37"/>
-        <w:ind w:left="453"/>
+        <w:rPr>
+          <w:lang w:val="kk-KZ"/>
+        </w:rPr>
+      </w:pPr>
+    </w:p>
+    <w:p>
+      <w:pPr>
+        <w:pStyle w:val="a3"/>
         <w:rPr>
           <w:b/>
           <w:sz w:val="24"/>
         </w:rPr>
       </w:pPr>
+      <w:r>
+        <w:rPr>
+          <w:lang w:val="kk-KZ"/>
+        </w:rPr>
+        <w:drawing>
+          <wp:inline distT="0" distB="0" distL="0" distR="0" wp14:anchorId="3D730C29" wp14:editId="7C9568B4">
+            <wp:extent cx="6303645" cy="2556510"/>
+            <wp:effectExtent l="0" t="0" r="1905" b="0"/>
+            <wp:docPr id="1049728858" name="Рисунок 1"/>
+            <wp:cNvGraphicFramePr>
+              <a:graphicFrameLocks xmlns:a="http://schemas.openxmlformats.org/drawingml/2006/main" noChangeAspect="1"/>
+            </wp:cNvGraphicFramePr>
+            <a:graphic xmlns:a="http://schemas.openxmlformats.org/drawingml/2006/main">
+              <a:graphicData uri="http://schemas.openxmlformats.org/drawingml/2006/picture">
+                <pic:pic xmlns:pic="http://schemas.openxmlformats.org/drawingml/2006/picture">
+                  <pic:nvPicPr>
+                    <pic:cNvPr id="1049728858" name=""/>
+                    <pic:cNvPicPr/>
+                  </pic:nvPicPr>
+                  <pic:blipFill>
+                    <a:blip r:embed="rId11"/>
+                    <a:stretch>
+                      <a:fillRect/>
+                    </a:stretch>
+                  </pic:blipFill>
+                  <pic:spPr>
+                    <a:xfrm>
+                      <a:off x="0" y="0"/>
+                      <a:ext cx="6303645" cy="2556510"/>
+                    </a:xfrm>
+                    <a:prstGeom prst="rect">
+                      <a:avLst/>
+                    </a:prstGeom>
+                  </pic:spPr>
+                </pic:pic>
+              </a:graphicData>
+            </a:graphic>
+          </wp:inline>
+        </w:drawing>
+      </w:r>
       <w:r>
         <w:rPr>
           <w:b/>
           <w:w w:val="120"/>
           <w:sz w:val="24"/>
         </w:rPr>
-        <w:lastRenderedPageBreak/>
         <w:t>Map</w:t>
       </w:r>
       <w:r>
@@ -11251,56 +11287,129 @@
       <w:pPr>
         <w:pStyle w:val="a3"/>
         <w:rPr>
-          <w:b/>
+          <w:bCs/>
           <w:sz w:val="24"/>
         </w:rPr>
       </w:pPr>
+      <w:r>
+        <w:rPr>
+          <w:bCs/>
+          <w:sz w:val="24"/>
+        </w:rPr>
+        <w:t>red 1</w:t>
+      </w:r>
     </w:p>
     <w:p>
       <w:pPr>
         <w:pStyle w:val="a3"/>
         <w:rPr>
-          <w:b/>
+          <w:bCs/>
           <w:sz w:val="24"/>
         </w:rPr>
       </w:pPr>
+      <w:r>
+        <w:rPr>
+          <w:bCs/>
+          <w:sz w:val="24"/>
+        </w:rPr>
+        <w:t>blue 1</w:t>
+      </w:r>
     </w:p>
     <w:p>
       <w:pPr>
         <w:pStyle w:val="a3"/>
         <w:rPr>
-          <w:b/>
+          <w:bCs/>
           <w:sz w:val="24"/>
         </w:rPr>
       </w:pPr>
+      <w:r>
+        <w:rPr>
+          <w:bCs/>
+          <w:sz w:val="24"/>
+        </w:rPr>
+        <w:t>red 1</w:t>
+      </w:r>
     </w:p>
     <w:p>
       <w:pPr>
         <w:pStyle w:val="a3"/>
         <w:rPr>
-          <w:b/>
+          <w:bCs/>
           <w:sz w:val="24"/>
         </w:rPr>
       </w:pPr>
+      <w:r>
+        <w:rPr>
+          <w:bCs/>
+          <w:sz w:val="24"/>
+        </w:rPr>
+        <w:t>blue 1</w:t>
+      </w:r>
     </w:p>
     <w:p>
       <w:pPr>
         <w:pStyle w:val="a3"/>
         <w:rPr>
-          <w:b/>
+          <w:bCs/>
           <w:sz w:val="24"/>
         </w:rPr>
       </w:pPr>
+      <w:r>
+        <w:rPr>
+          <w:bCs/>
+          <w:sz w:val="24"/>
+        </w:rPr>
+        <w:t>green 1</w:t>
+      </w:r>
     </w:p>
     <w:p>
       <w:pPr>
         <w:pStyle w:val="a3"/>
-        <w:spacing w:before="69"/>
-        <w:rPr>
-          <w:b/>
+        <w:rPr>
+          <w:bCs/>
           <w:sz w:val="24"/>
         </w:rPr>
       </w:pPr>
+      <w:r>
+        <w:rPr>
+          <w:bCs/>
+          <w:sz w:val="24"/>
+        </w:rPr>
+        <w:t>red 1</w:t>
+      </w:r>
+    </w:p>
+    <w:p>
+      <w:pPr>
+        <w:pStyle w:val="a3"/>
+        <w:rPr>
+          <w:bCs/>
+          <w:sz w:val="24"/>
+        </w:rPr>
+      </w:pPr>
+      <w:r>
+        <w:rPr>
+          <w:bCs/>
+          <w:sz w:val="24"/>
+        </w:rPr>
+        <w:t>green 1</w:t>
+      </w:r>
+    </w:p>
+    <w:p>
+      <w:pPr>
+        <w:pStyle w:val="a3"/>
+        <w:rPr>
+          <w:bCs/>
+          <w:sz w:val="24"/>
+        </w:rPr>
+      </w:pPr>
+      <w:r>
+        <w:rPr>
+          <w:bCs/>
+          <w:sz w:val="24"/>
+        </w:rPr>
+        <w:t>blue 1</w:t>
+      </w:r>
     </w:p>
     <w:p>
       <w:pPr>
@@ -11375,56 +11484,129 @@
       <w:pPr>
         <w:pStyle w:val="a3"/>
         <w:rPr>
-          <w:b/>
+          <w:bCs/>
           <w:sz w:val="24"/>
         </w:rPr>
       </w:pPr>
+      <w:r>
+        <w:rPr>
+          <w:bCs/>
+          <w:sz w:val="24"/>
+        </w:rPr>
+        <w:t>blue 1</w:t>
+      </w:r>
     </w:p>
     <w:p>
       <w:pPr>
         <w:pStyle w:val="a3"/>
         <w:rPr>
-          <w:b/>
+          <w:bCs/>
           <w:sz w:val="24"/>
         </w:rPr>
       </w:pPr>
+      <w:r>
+        <w:rPr>
+          <w:bCs/>
+          <w:sz w:val="24"/>
+        </w:rPr>
+        <w:t>blue 1</w:t>
+      </w:r>
     </w:p>
     <w:p>
       <w:pPr>
         <w:pStyle w:val="a3"/>
         <w:rPr>
-          <w:b/>
+          <w:bCs/>
           <w:sz w:val="24"/>
         </w:rPr>
       </w:pPr>
+      <w:r>
+        <w:rPr>
+          <w:bCs/>
+          <w:sz w:val="24"/>
+        </w:rPr>
+        <w:t>blue 1</w:t>
+      </w:r>
     </w:p>
     <w:p>
       <w:pPr>
         <w:pStyle w:val="a3"/>
         <w:rPr>
-          <w:b/>
+          <w:bCs/>
           <w:sz w:val="24"/>
         </w:rPr>
       </w:pPr>
+      <w:r>
+        <w:rPr>
+          <w:bCs/>
+          <w:sz w:val="24"/>
+        </w:rPr>
+        <w:t>green 1</w:t>
+      </w:r>
     </w:p>
     <w:p>
       <w:pPr>
         <w:pStyle w:val="a3"/>
         <w:rPr>
-          <w:b/>
+          <w:bCs/>
           <w:sz w:val="24"/>
         </w:rPr>
       </w:pPr>
+      <w:r>
+        <w:rPr>
+          <w:bCs/>
+          <w:sz w:val="24"/>
+        </w:rPr>
+        <w:t>green 1</w:t>
+      </w:r>
     </w:p>
     <w:p>
       <w:pPr>
         <w:pStyle w:val="a3"/>
-        <w:spacing w:before="70"/>
-        <w:rPr>
-          <w:b/>
+        <w:rPr>
+          <w:bCs/>
           <w:sz w:val="24"/>
         </w:rPr>
       </w:pPr>
+      <w:r>
+        <w:rPr>
+          <w:bCs/>
+          <w:sz w:val="24"/>
+        </w:rPr>
+        <w:t>red 1</w:t>
+      </w:r>
+    </w:p>
+    <w:p>
+      <w:pPr>
+        <w:pStyle w:val="a3"/>
+        <w:rPr>
+          <w:bCs/>
+          <w:sz w:val="24"/>
+        </w:rPr>
+      </w:pPr>
+      <w:r>
+        <w:rPr>
+          <w:bCs/>
+          <w:sz w:val="24"/>
+        </w:rPr>
+        <w:t>red 1</w:t>
+      </w:r>
+    </w:p>
+    <w:p>
+      <w:pPr>
+        <w:pStyle w:val="a3"/>
+        <w:rPr>
+          <w:bCs/>
+          <w:sz w:val="24"/>
+        </w:rPr>
+      </w:pPr>
+      <w:r>
+        <w:rPr>
+          <w:bCs/>
+          <w:sz w:val="24"/>
+        </w:rPr>
+        <w:t>red 1</w:t>
+      </w:r>
     </w:p>
     <w:p>
       <w:pPr>
@@ -11482,46 +11664,49 @@
       <w:pPr>
         <w:pStyle w:val="a3"/>
         <w:rPr>
-          <w:b/>
+          <w:bCs/>
           <w:sz w:val="24"/>
         </w:rPr>
       </w:pPr>
+      <w:r>
+        <w:rPr>
+          <w:bCs/>
+          <w:sz w:val="24"/>
+        </w:rPr>
+        <w:t>blue 3</w:t>
+      </w:r>
     </w:p>
     <w:p>
       <w:pPr>
         <w:pStyle w:val="a3"/>
         <w:rPr>
-          <w:b/>
+          <w:bCs/>
           <w:sz w:val="24"/>
         </w:rPr>
       </w:pPr>
+      <w:r>
+        <w:rPr>
+          <w:bCs/>
+          <w:sz w:val="24"/>
+        </w:rPr>
+        <w:t>green 2</w:t>
+      </w:r>
     </w:p>
     <w:p>
       <w:pPr>
         <w:pStyle w:val="a3"/>
         <w:rPr>
-          <w:b/>
+          <w:bCs/>
           <w:sz w:val="24"/>
         </w:rPr>
       </w:pPr>
-    </w:p>
-    <w:p>
-      <w:pPr>
-        <w:pStyle w:val="a3"/>
-        <w:rPr>
-          <w:b/>
+      <w:r>
+        <w:rPr>
+          <w:bCs/>
           <w:sz w:val="24"/>
         </w:rPr>
-      </w:pPr>
-    </w:p>
-    <w:p>
-      <w:pPr>
-        <w:pStyle w:val="a3"/>
-        <w:rPr>
-          <w:b/>
-          <w:sz w:val="24"/>
-        </w:rPr>
-      </w:pPr>
+        <w:t>red 3</w:t>
+      </w:r>
     </w:p>
     <w:p>
       <w:pPr>
@@ -11685,6 +11870,17 @@
     </w:p>
     <w:p>
       <w:pPr>
+        <w:tabs>
+          <w:tab w:val="left" w:pos="998"/>
+        </w:tabs>
+        <w:spacing w:before="190"/>
+      </w:pPr>
+      <w:r>
+        <w:t>No. It only outputs (word, 1) for every word it sees. The total is calculated later by the reducer</w:t>
+      </w:r>
+    </w:p>
+    <w:p>
+      <w:pPr>
         <w:pStyle w:val="a5"/>
         <w:numPr>
           <w:ilvl w:val="0"/>
@@ -11840,6 +12036,17 @@
     </w:p>
     <w:p>
       <w:pPr>
+        <w:tabs>
+          <w:tab w:val="left" w:pos="998"/>
+        </w:tabs>
+        <w:spacing w:before="165"/>
+      </w:pPr>
+      <w:r>
+        <w:t>No. Each mapper works on its own part of the input, so all mappers can run at the same time</w:t>
+      </w:r>
+    </w:p>
+    <w:p>
+      <w:pPr>
         <w:pStyle w:val="a5"/>
         <w:numPr>
           <w:ilvl w:val="0"/>
@@ -11852,6 +12059,7 @@
         <w:ind w:left="998" w:hanging="278"/>
       </w:pPr>
       <w:r>
+        <w:lastRenderedPageBreak/>
         <w:t>Which</w:t>
       </w:r>
       <w:r>
@@ -11928,6 +12136,17 @@
           <w:spacing w:val="-2"/>
         </w:rPr>
         <w:t>mappers?</w:t>
+      </w:r>
+    </w:p>
+    <w:p>
+      <w:pPr>
+        <w:tabs>
+          <w:tab w:val="left" w:pos="998"/>
+        </w:tabs>
+        <w:spacing w:before="165"/>
+      </w:pPr>
+      <w:r>
+        <w:t>Shuffle and sort</w:t>
       </w:r>
     </w:p>
     <w:p>
@@ -11981,6 +12200,17 @@
           <w:w w:val="105"/>
         </w:rPr>
         <w:t>available?</w:t>
+      </w:r>
+    </w:p>
+    <w:p>
+      <w:pPr>
+        <w:tabs>
+          <w:tab w:val="left" w:pos="998"/>
+        </w:tabs>
+        <w:spacing w:before="164"/>
+      </w:pPr>
+      <w:r>
+        <w:t>No. The reducer starts only after all mapper outputs for its keys are ready. Otherwise the count would be incomplete</w:t>
       </w:r>
     </w:p>
     <w:p>
@@ -21590,7 +21820,7 @@
           </mc:Choice>
           <mc:Fallback>
             <w:pict>
-              <v:shape w14:anchorId="3540A33E" id="Graphic 40" o:spid="_x0000_s1026" style="position:absolute;margin-left:121.8pt;margin-top:19.4pt;width:3.45pt;height:.1pt;z-index:-15977472;visibility:visible;mso-wrap-style:square;mso-wrap-distance-left:0;mso-wrap-distance-top:0;mso-wrap-distance-right:0;mso-wrap-distance-bottom:0;mso-position-horizontal:absolute;mso-position-horizontal-relative:page;mso-position-vertical:absolute;mso-position-vertical-relative:text;v-text-anchor:top" coordsize="43815,1270" o:gfxdata="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" path="m,l43637,e" filled="f" strokeweight=".14039mm">
+              <v:shape w14:anchorId="4BEE05B3" id="Graphic 40" o:spid="_x0000_s1026" style="position:absolute;margin-left:121.8pt;margin-top:19.4pt;width:3.45pt;height:.1pt;z-index:-15977472;visibility:visible;mso-wrap-style:square;mso-wrap-distance-left:0;mso-wrap-distance-top:0;mso-wrap-distance-right:0;mso-wrap-distance-bottom:0;mso-position-horizontal:absolute;mso-position-horizontal-relative:page;mso-position-vertical:absolute;mso-position-vertical-relative:text;v-text-anchor:top" coordsize="43815,1270" o:gfxdata="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" path="m,l43637,e" filled="f" strokeweight=".14039mm">
                 <v:path arrowok="t"/>
                 <w10:wrap anchorx="page"/>
               </v:shape>
@@ -21704,7 +21934,7 @@
           </mc:Choice>
           <mc:Fallback>
             <w:pict>
-              <v:shape w14:anchorId="0AE71231" id="Graphic 41" o:spid="_x0000_s1026" style="position:absolute;margin-left:121.8pt;margin-top:19.35pt;width:3.45pt;height:.1pt;z-index:-15976960;visibility:visible;mso-wrap-style:square;mso-wrap-distance-left:0;mso-wrap-distance-top:0;mso-wrap-distance-right:0;mso-wrap-distance-bottom:0;mso-position-horizontal:absolute;mso-position-horizontal-relative:page;mso-position-vertical:absolute;mso-position-vertical-relative:text;v-text-anchor:top" coordsize="43815,1270" o:gfxdata="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" path="m,l43637,e" filled="f" strokeweight=".14039mm">
+              <v:shape w14:anchorId="6C4A380F" id="Graphic 41" o:spid="_x0000_s1026" style="position:absolute;margin-left:121.8pt;margin-top:19.35pt;width:3.45pt;height:.1pt;z-index:-15976960;visibility:visible;mso-wrap-style:square;mso-wrap-distance-left:0;mso-wrap-distance-top:0;mso-wrap-distance-right:0;mso-wrap-distance-bottom:0;mso-position-horizontal:absolute;mso-position-horizontal-relative:page;mso-position-vertical:absolute;mso-position-vertical-relative:text;v-text-anchor:top" coordsize="43815,1270" o:gfxdata="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" path="m,l43637,e" filled="f" strokeweight=".14039mm">
                 <v:path arrowok="t"/>
                 <w10:wrap anchorx="page"/>
               </v:shape>
@@ -22324,7 +22554,6 @@
       <w:lvlJc w:val="left"/>
       <w:pPr>
         <w:ind w:left="999" w:hanging="279"/>
-        <w:jc w:val="left"/>
       </w:pPr>
       <w:rPr>
         <w:rFonts w:ascii="Calibri" w:eastAsia="Calibri" w:hAnsi="Calibri" w:cs="Calibri" w:hint="default"/>
@@ -22447,7 +22676,6 @@
       <w:lvlJc w:val="left"/>
       <w:pPr>
         <w:ind w:left="999" w:hanging="279"/>
-        <w:jc w:val="left"/>
       </w:pPr>
       <w:rPr>
         <w:rFonts w:ascii="Calibri" w:eastAsia="Calibri" w:hAnsi="Calibri" w:cs="Calibri" w:hint="default"/>
@@ -22693,7 +22921,6 @@
       <w:lvlJc w:val="left"/>
       <w:pPr>
         <w:ind w:left="999" w:hanging="279"/>
-        <w:jc w:val="left"/>
       </w:pPr>
       <w:rPr>
         <w:rFonts w:ascii="Calibri" w:eastAsia="Calibri" w:hAnsi="Calibri" w:cs="Calibri" w:hint="default"/>
@@ -22816,7 +23043,6 @@
       <w:lvlJc w:val="left"/>
       <w:pPr>
         <w:ind w:left="999" w:hanging="279"/>
-        <w:jc w:val="left"/>
       </w:pPr>
       <w:rPr>
         <w:rFonts w:ascii="Calibri" w:eastAsia="Calibri" w:hAnsi="Calibri" w:cs="Calibri" w:hint="default"/>
@@ -22939,7 +23165,6 @@
       <w:lvlJc w:val="left"/>
       <w:pPr>
         <w:ind w:left="782" w:hanging="329"/>
-        <w:jc w:val="left"/>
       </w:pPr>
       <w:rPr>
         <w:rFonts w:ascii="Calibri" w:eastAsia="Calibri" w:hAnsi="Calibri" w:cs="Calibri" w:hint="default"/>
@@ -22961,7 +23186,6 @@
       <w:lvlJc w:val="left"/>
       <w:pPr>
         <w:ind w:left="999" w:hanging="279"/>
-        <w:jc w:val="left"/>
       </w:pPr>
       <w:rPr>
         <w:rFonts w:ascii="Calibri" w:eastAsia="Calibri" w:hAnsi="Calibri" w:cs="Calibri" w:hint="default"/>
@@ -23072,7 +23296,6 @@
       <w:lvlJc w:val="left"/>
       <w:pPr>
         <w:ind w:left="999" w:hanging="279"/>
-        <w:jc w:val="left"/>
       </w:pPr>
       <w:rPr>
         <w:rFonts w:ascii="Calibri" w:eastAsia="Calibri" w:hAnsi="Calibri" w:cs="Calibri" w:hint="default"/>
@@ -23316,7 +23539,6 @@
       <w:lvlJc w:val="left"/>
       <w:pPr>
         <w:ind w:left="999" w:hanging="279"/>
-        <w:jc w:val="left"/>
       </w:pPr>
       <w:rPr>
         <w:rFonts w:ascii="Calibri" w:eastAsia="Calibri" w:hAnsi="Calibri" w:cs="Calibri" w:hint="default"/>
@@ -23439,7 +23661,6 @@
       <w:lvlJc w:val="left"/>
       <w:pPr>
         <w:ind w:left="999" w:hanging="279"/>
-        <w:jc w:val="left"/>
       </w:pPr>
       <w:rPr>
         <w:rFonts w:ascii="Calibri" w:eastAsia="Calibri" w:hAnsi="Calibri" w:cs="Calibri" w:hint="default"/>
@@ -23562,7 +23783,6 @@
       <w:lvlJc w:val="left"/>
       <w:pPr>
         <w:ind w:left="999" w:hanging="279"/>
-        <w:jc w:val="left"/>
       </w:pPr>
       <w:rPr>
         <w:rFonts w:ascii="Calibri" w:eastAsia="Calibri" w:hAnsi="Calibri" w:cs="Calibri" w:hint="default"/>
@@ -23685,7 +23905,6 @@
       <w:lvlJc w:val="left"/>
       <w:pPr>
         <w:ind w:left="999" w:hanging="279"/>
-        <w:jc w:val="left"/>
       </w:pPr>
       <w:rPr>
         <w:rFonts w:ascii="Calibri" w:eastAsia="Calibri" w:hAnsi="Calibri" w:cs="Calibri" w:hint="default"/>

</xml_diff>

<commit_message>
Part 4: updated .docx
</commit_message>
<xml_diff>
--- a/Lab6_AbdanurAyazbek_BDA2406.docx
+++ b/Lab6_AbdanurAyazbek_BDA2406.docx
@@ -586,12 +586,14 @@
         <w:spacing w:before="241"/>
         <w:ind w:left="453"/>
       </w:pPr>
+      <w:proofErr w:type="spellStart"/>
       <w:r>
         <w:rPr>
           <w:w w:val="110"/>
         </w:rPr>
         <w:t>sudo</w:t>
       </w:r>
+      <w:proofErr w:type="spellEnd"/>
       <w:r>
         <w:rPr>
           <w:spacing w:val="57"/>
@@ -626,12 +628,14 @@
         <w:spacing w:before="3"/>
         <w:ind w:left="453"/>
       </w:pPr>
+      <w:proofErr w:type="spellStart"/>
       <w:r>
         <w:rPr>
           <w:w w:val="120"/>
         </w:rPr>
         <w:t>sudo</w:t>
       </w:r>
+      <w:proofErr w:type="spellEnd"/>
       <w:r>
         <w:rPr>
           <w:spacing w:val="63"/>
@@ -3272,6 +3276,7 @@
                                 <w:sz w:val="16"/>
                               </w:rPr>
                             </w:pPr>
+                            <w:proofErr w:type="spellStart"/>
                             <w:r>
                               <w:rPr>
                                 <w:i/>
@@ -3281,6 +3286,7 @@
                               </w:rPr>
                               <w:t>i</w:t>
                             </w:r>
+                            <w:proofErr w:type="spellEnd"/>
                           </w:p>
                         </w:txbxContent>
                       </wps:txbx>
@@ -3306,6 +3312,7 @@
                           <w:sz w:val="16"/>
                         </w:rPr>
                       </w:pPr>
+                      <w:proofErr w:type="spellStart"/>
                       <w:r>
                         <w:rPr>
                           <w:i/>
@@ -3315,6 +3322,7 @@
                         </w:rPr>
                         <w:t>i</w:t>
                       </w:r>
+                      <w:proofErr w:type="spellEnd"/>
                     </w:p>
                   </w:txbxContent>
                 </v:textbox>
@@ -5495,13 +5503,23 @@
                               </w:rPr>
                               <w:t xml:space="preserve"> </w:t>
                             </w:r>
+                            <w:proofErr w:type="spellStart"/>
                             <w:r>
                               <w:rPr>
                                 <w:spacing w:val="17"/>
                                 <w:w w:val="145"/>
                                 <w:sz w:val="20"/>
                               </w:rPr>
-                              <w:t>findall(</w:t>
+                              <w:t>findall</w:t>
+                            </w:r>
+                            <w:proofErr w:type="spellEnd"/>
+                            <w:r>
+                              <w:rPr>
+                                <w:spacing w:val="17"/>
+                                <w:w w:val="145"/>
+                                <w:sz w:val="20"/>
+                              </w:rPr>
+                              <w:t>(</w:t>
                             </w:r>
                             <w:r>
                               <w:rPr>
@@ -6178,13 +6196,23 @@
                         </w:rPr>
                         <w:t xml:space="preserve"> </w:t>
                       </w:r>
+                      <w:proofErr w:type="spellStart"/>
                       <w:r>
                         <w:rPr>
                           <w:spacing w:val="17"/>
                           <w:w w:val="145"/>
                           <w:sz w:val="20"/>
                         </w:rPr>
-                        <w:t>findall(</w:t>
+                        <w:t>findall</w:t>
+                      </w:r>
+                      <w:proofErr w:type="spellEnd"/>
+                      <w:r>
+                        <w:rPr>
+                          <w:spacing w:val="17"/>
+                          <w:w w:val="145"/>
+                          <w:sz w:val="20"/>
+                        </w:rPr>
+                        <w:t>(</w:t>
                       </w:r>
                       <w:r>
                         <w:rPr>
@@ -7979,6 +8007,7 @@
                                 <w:sz w:val="20"/>
                               </w:rPr>
                             </w:pPr>
+                            <w:proofErr w:type="spellStart"/>
                             <w:r>
                               <w:rPr>
                                 <w:spacing w:val="17"/>
@@ -7987,6 +8016,7 @@
                               </w:rPr>
                               <w:t>current_word</w:t>
                             </w:r>
+                            <w:proofErr w:type="spellEnd"/>
                             <w:r>
                               <w:rPr>
                                 <w:spacing w:val="67"/>
@@ -8018,6 +8048,7 @@
                               </w:rPr>
                               <w:t xml:space="preserve">None </w:t>
                             </w:r>
+                            <w:proofErr w:type="spellStart"/>
                             <w:r>
                               <w:rPr>
                                 <w:spacing w:val="17"/>
@@ -8026,6 +8057,7 @@
                               </w:rPr>
                               <w:t>current_count</w:t>
                             </w:r>
+                            <w:proofErr w:type="spellEnd"/>
                             <w:r>
                               <w:rPr>
                                 <w:spacing w:val="80"/>
@@ -8472,6 +8504,7 @@
                               </w:rPr>
                               <w:t xml:space="preserve"> </w:t>
                             </w:r>
+                            <w:proofErr w:type="spellStart"/>
                             <w:r>
                               <w:rPr>
                                 <w:spacing w:val="17"/>
@@ -8480,6 +8513,7 @@
                               </w:rPr>
                               <w:t>current_word</w:t>
                             </w:r>
+                            <w:proofErr w:type="spellEnd"/>
                             <w:r>
                               <w:rPr>
                                 <w:spacing w:val="-25"/>
@@ -9042,6 +9076,7 @@
                           <w:sz w:val="20"/>
                         </w:rPr>
                       </w:pPr>
+                      <w:proofErr w:type="spellStart"/>
                       <w:r>
                         <w:rPr>
                           <w:spacing w:val="17"/>
@@ -9050,6 +9085,7 @@
                         </w:rPr>
                         <w:t>current_word</w:t>
                       </w:r>
+                      <w:proofErr w:type="spellEnd"/>
                       <w:r>
                         <w:rPr>
                           <w:spacing w:val="67"/>
@@ -9081,6 +9117,7 @@
                         </w:rPr>
                         <w:t xml:space="preserve">None </w:t>
                       </w:r>
+                      <w:proofErr w:type="spellStart"/>
                       <w:r>
                         <w:rPr>
                           <w:spacing w:val="17"/>
@@ -9089,6 +9126,7 @@
                         </w:rPr>
                         <w:t>current_count</w:t>
                       </w:r>
+                      <w:proofErr w:type="spellEnd"/>
                       <w:r>
                         <w:rPr>
                           <w:spacing w:val="80"/>
@@ -9535,6 +9573,7 @@
                         </w:rPr>
                         <w:t xml:space="preserve"> </w:t>
                       </w:r>
+                      <w:proofErr w:type="spellStart"/>
                       <w:r>
                         <w:rPr>
                           <w:spacing w:val="17"/>
@@ -9543,6 +9582,7 @@
                         </w:rPr>
                         <w:t>current_word</w:t>
                       </w:r>
+                      <w:proofErr w:type="spellEnd"/>
                       <w:r>
                         <w:rPr>
                           <w:spacing w:val="-25"/>
@@ -12513,12 +12553,14 @@
         </w:rPr>
         <w:t xml:space="preserve"> </w:t>
       </w:r>
+      <w:proofErr w:type="spellStart"/>
       <w:r>
         <w:rPr>
           <w:w w:val="115"/>
         </w:rPr>
         <w:t>data</w:t>
       </w:r>
+      <w:proofErr w:type="spellEnd"/>
       <w:r>
         <w:rPr>
           <w:spacing w:val="69"/>
@@ -13584,7 +13626,11 @@
         <w:pStyle w:val="a3"/>
         <w:spacing w:before="241" w:line="242" w:lineRule="auto"/>
         <w:ind w:left="453" w:right="7168"/>
-      </w:pPr>
+        <w:rPr>
+          <w:w w:val="120"/>
+        </w:rPr>
+      </w:pPr>
+      <w:proofErr w:type="spellStart"/>
       <w:r>
         <w:rPr>
           <w:spacing w:val="-2"/>
@@ -13592,6 +13638,7 @@
         </w:rPr>
         <w:t>wc</w:t>
       </w:r>
+      <w:proofErr w:type="spellEnd"/>
       <w:r>
         <w:rPr>
           <w:spacing w:val="-1"/>
@@ -13620,12 +13667,14 @@
         </w:rPr>
         <w:t xml:space="preserve">map_output.txt </w:t>
       </w:r>
+      <w:proofErr w:type="spellStart"/>
       <w:r>
         <w:rPr>
           <w:w w:val="120"/>
         </w:rPr>
         <w:t>wc</w:t>
       </w:r>
+      <w:proofErr w:type="spellEnd"/>
       <w:r>
         <w:rPr>
           <w:w w:val="165"/>
@@ -13637,6 +13686,50 @@
           <w:w w:val="120"/>
         </w:rPr>
         <w:t>combined1.txt</w:t>
+      </w:r>
+    </w:p>
+    <w:p>
+      <w:pPr>
+        <w:pStyle w:val="a3"/>
+        <w:spacing w:before="241" w:line="242" w:lineRule="auto"/>
+        <w:ind w:right="7168"/>
+      </w:pPr>
+      <w:r>
+        <w:drawing>
+          <wp:inline distT="0" distB="0" distL="0" distR="0" wp14:anchorId="1A558FD3" wp14:editId="0CFDB584">
+            <wp:extent cx="6303645" cy="1297305"/>
+            <wp:effectExtent l="0" t="0" r="1905" b="0"/>
+            <wp:docPr id="304420936" name="Рисунок 1"/>
+            <wp:cNvGraphicFramePr>
+              <a:graphicFrameLocks xmlns:a="http://schemas.openxmlformats.org/drawingml/2006/main" noChangeAspect="1"/>
+            </wp:cNvGraphicFramePr>
+            <a:graphic xmlns:a="http://schemas.openxmlformats.org/drawingml/2006/main">
+              <a:graphicData uri="http://schemas.openxmlformats.org/drawingml/2006/picture">
+                <pic:pic xmlns:pic="http://schemas.openxmlformats.org/drawingml/2006/picture">
+                  <pic:nvPicPr>
+                    <pic:cNvPr id="304420936" name=""/>
+                    <pic:cNvPicPr/>
+                  </pic:nvPicPr>
+                  <pic:blipFill>
+                    <a:blip r:embed="rId12"/>
+                    <a:stretch>
+                      <a:fillRect/>
+                    </a:stretch>
+                  </pic:blipFill>
+                  <pic:spPr>
+                    <a:xfrm>
+                      <a:off x="0" y="0"/>
+                      <a:ext cx="6303645" cy="1297305"/>
+                    </a:xfrm>
+                    <a:prstGeom prst="rect">
+                      <a:avLst/>
+                    </a:prstGeom>
+                  </pic:spPr>
+                </pic:pic>
+              </a:graphicData>
+            </a:graphic>
+          </wp:inline>
+        </w:drawing>
       </w:r>
     </w:p>
     <w:p>
@@ -13780,6 +13873,17 @@
     </w:p>
     <w:p>
       <w:pPr>
+        <w:tabs>
+          <w:tab w:val="left" w:pos="998"/>
+        </w:tabs>
+        <w:spacing w:before="242"/>
+      </w:pPr>
+      <w:r>
+        <w:t>No. The final result is data 4, science 3, the same as without a combiner</w:t>
+      </w:r>
+    </w:p>
+    <w:p>
+      <w:pPr>
         <w:pStyle w:val="a5"/>
         <w:numPr>
           <w:ilvl w:val="0"/>
@@ -13917,6 +14021,17 @@
     </w:p>
     <w:p>
       <w:pPr>
+        <w:tabs>
+          <w:tab w:val="left" w:pos="998"/>
+        </w:tabs>
+        <w:spacing w:before="181"/>
+      </w:pPr>
+      <w:r>
+        <w:t>Yes. For part1.txt the mapper produced 4 records, and the combiner reduced them to 2</w:t>
+      </w:r>
+    </w:p>
+    <w:p>
+      <w:pPr>
         <w:pStyle w:val="a5"/>
         <w:numPr>
           <w:ilvl w:val="0"/>
@@ -14028,6 +14143,16 @@
     </w:p>
     <w:p>
       <w:pPr>
+        <w:tabs>
+          <w:tab w:val="left" w:pos="998"/>
+        </w:tabs>
+      </w:pPr>
+      <w:r>
+        <w:t>Intermediate data is sent over the network from mappers to reducers. Fewer records means less data to send, so the transfer takes less time</w:t>
+      </w:r>
+    </w:p>
+    <w:p>
+      <w:pPr>
         <w:pStyle w:val="a5"/>
         <w:numPr>
           <w:ilvl w:val="0"/>
@@ -14152,6 +14277,16 @@
     </w:p>
     <w:p>
       <w:pPr>
+        <w:tabs>
+          <w:tab w:val="left" w:pos="998"/>
+        </w:tabs>
+      </w:pPr>
+      <w:r>
+        <w:t>Addition gives the same result in any order and grouping: (1 + 1 + 1) + 1 = 1 + 1 + 1 + 1. So adding partial sums first does not change the total</w:t>
+      </w:r>
+    </w:p>
+    <w:p>
+      <w:pPr>
         <w:pStyle w:val="a3"/>
         <w:spacing w:before="93"/>
       </w:pPr>
@@ -14164,6 +14299,7 @@
         <w:rPr>
           <w:w w:val="125"/>
         </w:rPr>
+        <w:lastRenderedPageBreak/>
         <w:t>Part</w:t>
       </w:r>
       <w:r>
@@ -14642,6 +14778,7 @@
                                 <w:sz w:val="16"/>
                               </w:rPr>
                             </w:pPr>
+                            <w:proofErr w:type="spellStart"/>
                             <w:r>
                               <w:rPr>
                                 <w:i/>
@@ -14666,6 +14803,7 @@
                               </w:rPr>
                               <w:t>k</w:t>
                             </w:r>
+                            <w:proofErr w:type="spellEnd"/>
                           </w:p>
                         </w:txbxContent>
                       </wps:txbx>
@@ -14691,6 +14829,7 @@
                           <w:sz w:val="16"/>
                         </w:rPr>
                       </w:pPr>
+                      <w:proofErr w:type="spellStart"/>
                       <w:r>
                         <w:rPr>
                           <w:i/>
@@ -14715,6 +14854,7 @@
                         </w:rPr>
                         <w:t>k</w:t>
                       </w:r>
+                      <w:proofErr w:type="spellEnd"/>
                     </w:p>
                   </w:txbxContent>
                 </v:textbox>
@@ -15374,7 +15514,21 @@
                                 <w:rPr>
                                   <w:spacing w:val="-2"/>
                                 </w:rPr>
-                                <w:t>science parallel computer hadoop reduce</w:t>
+                                <w:t xml:space="preserve">science parallel computer </w:t>
+                              </w:r>
+                              <w:proofErr w:type="spellStart"/>
+                              <w:r>
+                                <w:rPr>
+                                  <w:spacing w:val="-2"/>
+                                </w:rPr>
+                                <w:t>hadoop</w:t>
+                              </w:r>
+                              <w:proofErr w:type="spellEnd"/>
+                              <w:r>
+                                <w:rPr>
+                                  <w:spacing w:val="-2"/>
+                                </w:rPr>
+                                <w:t xml:space="preserve"> reduce</w:t>
                               </w:r>
                             </w:p>
                           </w:txbxContent>
@@ -15468,7 +15622,21 @@
                           <w:rPr>
                             <w:spacing w:val="-2"/>
                           </w:rPr>
-                          <w:t>science parallel computer hadoop reduce</w:t>
+                          <w:t xml:space="preserve">science parallel computer </w:t>
+                        </w:r>
+                        <w:proofErr w:type="spellStart"/>
+                        <w:r>
+                          <w:rPr>
+                            <w:spacing w:val="-2"/>
+                          </w:rPr>
+                          <w:t>hadoop</w:t>
+                        </w:r>
+                        <w:proofErr w:type="spellEnd"/>
+                        <w:r>
+                          <w:rPr>
+                            <w:spacing w:val="-2"/>
+                          </w:rPr>
+                          <w:t xml:space="preserve"> reduce</w:t>
                         </w:r>
                       </w:p>
                     </w:txbxContent>
@@ -15512,14 +15680,29 @@
         <w:rPr>
           <w:w w:val="105"/>
         </w:rPr>
-        <w:t>Can the same intermediate key be sent to two different reducers in a normal per-key reduc-</w:t>
+        <w:t xml:space="preserve">Can the same intermediate key be sent to two different reducers in a normal per-key </w:t>
+      </w:r>
+      <w:proofErr w:type="spellStart"/>
+      <w:r>
+        <w:rPr>
+          <w:w w:val="105"/>
+        </w:rPr>
+        <w:t>reduc-</w:t>
       </w:r>
       <w:r>
         <w:rPr>
           <w:spacing w:val="-2"/>
           <w:w w:val="105"/>
         </w:rPr>
-        <w:t>tion?</w:t>
+        <w:t>tion</w:t>
+      </w:r>
+      <w:proofErr w:type="spellEnd"/>
+      <w:r>
+        <w:rPr>
+          <w:spacing w:val="-2"/>
+          <w:w w:val="105"/>
+        </w:rPr>
+        <w:t>?</w:t>
       </w:r>
     </w:p>
     <w:p>
@@ -16294,12 +16477,14 @@
       <w:r>
         <w:tab/>
       </w:r>
+      <w:proofErr w:type="spellStart"/>
       <w:r>
         <w:rPr>
           <w:w w:val="115"/>
         </w:rPr>
         <w:t>mapreduce</w:t>
       </w:r>
+      <w:proofErr w:type="spellEnd"/>
       <w:r>
         <w:rPr>
           <w:spacing w:val="40"/>
@@ -20039,12 +20224,21 @@
         </w:rPr>
         <w:t xml:space="preserve"> </w:t>
       </w:r>
+      <w:proofErr w:type="spellStart"/>
       <w:r>
         <w:rPr>
           <w:spacing w:val="-2"/>
           <w:w w:val="105"/>
         </w:rPr>
-        <w:t>NameNode?</w:t>
+        <w:t>NameNode</w:t>
+      </w:r>
+      <w:proofErr w:type="spellEnd"/>
+      <w:r>
+        <w:rPr>
+          <w:spacing w:val="-2"/>
+          <w:w w:val="105"/>
+        </w:rPr>
+        <w:t>?</w:t>
       </w:r>
     </w:p>
     <w:p>
@@ -20162,12 +20356,21 @@
         </w:rPr>
         <w:t xml:space="preserve"> </w:t>
       </w:r>
+      <w:proofErr w:type="spellStart"/>
       <w:r>
         <w:rPr>
           <w:spacing w:val="-2"/>
           <w:w w:val="105"/>
         </w:rPr>
-        <w:t>DataNode?</w:t>
+        <w:t>DataNode</w:t>
+      </w:r>
+      <w:proofErr w:type="spellEnd"/>
+      <w:r>
+        <w:rPr>
+          <w:spacing w:val="-2"/>
+          <w:w w:val="105"/>
+        </w:rPr>
+        <w:t>?</w:t>
       </w:r>
     </w:p>
     <w:p>
@@ -20201,9 +20404,11 @@
         </w:rPr>
         <w:t xml:space="preserve"> </w:t>
       </w:r>
+      <w:proofErr w:type="spellStart"/>
       <w:r>
         <w:t>NameNode</w:t>
       </w:r>
+      <w:proofErr w:type="spellEnd"/>
       <w:r>
         <w:rPr>
           <w:spacing w:val="27"/>
@@ -21820,7 +22025,7 @@
           </mc:Choice>
           <mc:Fallback>
             <w:pict>
-              <v:shape w14:anchorId="4BEE05B3" id="Graphic 40" o:spid="_x0000_s1026" style="position:absolute;margin-left:121.8pt;margin-top:19.4pt;width:3.45pt;height:.1pt;z-index:-15977472;visibility:visible;mso-wrap-style:square;mso-wrap-distance-left:0;mso-wrap-distance-top:0;mso-wrap-distance-right:0;mso-wrap-distance-bottom:0;mso-position-horizontal:absolute;mso-position-horizontal-relative:page;mso-position-vertical:absolute;mso-position-vertical-relative:text;v-text-anchor:top" coordsize="43815,1270" o:gfxdata="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" path="m,l43637,e" filled="f" strokeweight=".14039mm">
+              <v:shape w14:anchorId="0095DD45" id="Graphic 40" o:spid="_x0000_s1026" style="position:absolute;margin-left:121.8pt;margin-top:19.4pt;width:3.45pt;height:.1pt;z-index:-15977472;visibility:visible;mso-wrap-style:square;mso-wrap-distance-left:0;mso-wrap-distance-top:0;mso-wrap-distance-right:0;mso-wrap-distance-bottom:0;mso-position-horizontal:absolute;mso-position-horizontal-relative:page;mso-position-vertical:absolute;mso-position-vertical-relative:text;v-text-anchor:top" coordsize="43815,1270" o:gfxdata="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" path="m,l43637,e" filled="f" strokeweight=".14039mm">
                 <v:path arrowok="t"/>
                 <w10:wrap anchorx="page"/>
               </v:shape>
@@ -21934,7 +22139,7 @@
           </mc:Choice>
           <mc:Fallback>
             <w:pict>
-              <v:shape w14:anchorId="6C4A380F" id="Graphic 41" o:spid="_x0000_s1026" style="position:absolute;margin-left:121.8pt;margin-top:19.35pt;width:3.45pt;height:.1pt;z-index:-15976960;visibility:visible;mso-wrap-style:square;mso-wrap-distance-left:0;mso-wrap-distance-top:0;mso-wrap-distance-right:0;mso-wrap-distance-bottom:0;mso-position-horizontal:absolute;mso-position-horizontal-relative:page;mso-position-vertical:absolute;mso-position-vertical-relative:text;v-text-anchor:top" coordsize="43815,1270" o:gfxdata="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" path="m,l43637,e" filled="f" strokeweight=".14039mm">
+              <v:shape w14:anchorId="7BC4CB3E" id="Graphic 41" o:spid="_x0000_s1026" style="position:absolute;margin-left:121.8pt;margin-top:19.35pt;width:3.45pt;height:.1pt;z-index:-15976960;visibility:visible;mso-wrap-style:square;mso-wrap-distance-left:0;mso-wrap-distance-top:0;mso-wrap-distance-right:0;mso-wrap-distance-bottom:0;mso-position-horizontal:absolute;mso-position-horizontal-relative:page;mso-position-vertical:absolute;mso-position-vertical-relative:text;v-text-anchor:top" coordsize="43815,1270" o:gfxdata="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" path="m,l43637,e" filled="f" strokeweight=".14039mm">
                 <v:path arrowok="t"/>
                 <w10:wrap anchorx="page"/>
               </v:shape>

</xml_diff>

<commit_message>
Part 6: inverted index
</commit_message>
<xml_diff>
--- a/Lab6_AbdanurAyazbek_BDA2406.docx
+++ b/Lab6_AbdanurAyazbek_BDA2406.docx
@@ -6,7 +6,6 @@
       <w:pPr>
         <w:pStyle w:val="a4"/>
       </w:pPr>
-      <w:proofErr w:type="gramStart"/>
       <w:r>
         <w:rPr>
           <w:w w:val="120"/>
@@ -26,7 +25,6 @@
         </w:rPr>
         <w:t>Performance</w:t>
       </w:r>
-      <w:proofErr w:type="gramEnd"/>
       <w:r>
         <w:rPr>
           <w:spacing w:val="27"/>
@@ -325,14 +323,12 @@
         </w:rPr>
         <w:t xml:space="preserve"> </w:t>
       </w:r>
-      <w:proofErr w:type="gramStart"/>
       <w:r>
         <w:rPr>
           <w:w w:val="110"/>
         </w:rPr>
         <w:t>sort</w:t>
       </w:r>
-      <w:proofErr w:type="gramEnd"/>
       <w:r>
         <w:rPr>
           <w:spacing w:val="18"/>
@@ -590,14 +586,12 @@
         <w:spacing w:before="241"/>
         <w:ind w:left="453"/>
       </w:pPr>
-      <w:proofErr w:type="spellStart"/>
       <w:r>
         <w:rPr>
           <w:w w:val="110"/>
         </w:rPr>
         <w:t>sudo</w:t>
       </w:r>
-      <w:proofErr w:type="spellEnd"/>
       <w:r>
         <w:rPr>
           <w:spacing w:val="57"/>
@@ -632,14 +626,12 @@
         <w:spacing w:before="3"/>
         <w:ind w:left="453"/>
       </w:pPr>
-      <w:proofErr w:type="spellStart"/>
       <w:r>
         <w:rPr>
           <w:w w:val="120"/>
         </w:rPr>
         <w:t>sudo</w:t>
       </w:r>
-      <w:proofErr w:type="spellEnd"/>
       <w:r>
         <w:rPr>
           <w:spacing w:val="63"/>
@@ -896,14 +888,12 @@
         <w:spacing w:before="242"/>
         <w:ind w:left="453"/>
       </w:pPr>
-      <w:proofErr w:type="gramStart"/>
       <w:r>
         <w:rPr>
           <w:w w:val="120"/>
         </w:rPr>
         <w:t>brew</w:t>
       </w:r>
-      <w:proofErr w:type="gramEnd"/>
       <w:r>
         <w:rPr>
           <w:spacing w:val="54"/>
@@ -924,7 +914,6 @@
         </w:rPr>
         <w:t xml:space="preserve"> </w:t>
       </w:r>
-      <w:proofErr w:type="gramStart"/>
       <w:r>
         <w:rPr>
           <w:spacing w:val="-2"/>
@@ -932,7 +921,6 @@
         </w:rPr>
         <w:t>python</w:t>
       </w:r>
-      <w:proofErr w:type="gramEnd"/>
     </w:p>
     <w:p>
       <w:pPr>
@@ -2741,14 +2729,12 @@
         </w:rPr>
         <w:t xml:space="preserve"> </w:t>
       </w:r>
-      <w:proofErr w:type="gramStart"/>
       <w:r>
         <w:rPr>
           <w:w w:val="105"/>
         </w:rPr>
         <w:t>having</w:t>
       </w:r>
-      <w:proofErr w:type="gramEnd"/>
       <w:r>
         <w:rPr>
           <w:spacing w:val="9"/>
@@ -3286,8 +3272,6 @@
                                 <w:sz w:val="16"/>
                               </w:rPr>
                             </w:pPr>
-                            <w:proofErr w:type="spellStart"/>
-                            <w:proofErr w:type="gramStart"/>
                             <w:r>
                               <w:rPr>
                                 <w:i/>
@@ -3297,8 +3281,6 @@
                               </w:rPr>
                               <w:t>i</w:t>
                             </w:r>
-                            <w:proofErr w:type="spellEnd"/>
-                            <w:proofErr w:type="gramEnd"/>
                           </w:p>
                         </w:txbxContent>
                       </wps:txbx>
@@ -3324,8 +3306,6 @@
                           <w:sz w:val="16"/>
                         </w:rPr>
                       </w:pPr>
-                      <w:proofErr w:type="spellStart"/>
-                      <w:proofErr w:type="gramStart"/>
                       <w:r>
                         <w:rPr>
                           <w:i/>
@@ -3335,8 +3315,6 @@
                         </w:rPr>
                         <w:t>i</w:t>
                       </w:r>
-                      <w:proofErr w:type="spellEnd"/>
-                      <w:proofErr w:type="gramEnd"/>
                     </w:p>
                   </w:txbxContent>
                 </v:textbox>
@@ -4042,29 +4020,8 @@
           <w:tab w:val="left" w:pos="998"/>
         </w:tabs>
       </w:pPr>
-      <w:proofErr w:type="gramStart"/>
-      <w:r>
-        <w:t>Collects</w:t>
-      </w:r>
-      <w:proofErr w:type="gramEnd"/>
-      <w:r>
-        <w:t xml:space="preserve"> the pairs from all mappers, </w:t>
-      </w:r>
-      <w:proofErr w:type="gramStart"/>
-      <w:r>
-        <w:t>puts</w:t>
-      </w:r>
-      <w:proofErr w:type="gramEnd"/>
-      <w:r>
-        <w:t xml:space="preserve"> pairs with the same key into one group and </w:t>
-      </w:r>
-      <w:proofErr w:type="gramStart"/>
-      <w:r>
-        <w:t>sorts</w:t>
-      </w:r>
-      <w:proofErr w:type="gramEnd"/>
-      <w:r>
-        <w:t xml:space="preserve"> the groups by key. Each group goes to its reducer</w:t>
+      <w:r>
+        <w:t>Collects the pairs from all mappers, puts pairs with the same key into one group and sorts the groups by key. Each group goes to its reducer</w:t>
       </w:r>
     </w:p>
     <w:p>
@@ -5213,7 +5170,6 @@
                                 <w:sz w:val="20"/>
                               </w:rPr>
                             </w:pPr>
-                            <w:proofErr w:type="gramStart"/>
                             <w:r>
                               <w:rPr>
                                 <w:spacing w:val="14"/>
@@ -5222,7 +5178,6 @@
                               </w:rPr>
                               <w:t>import</w:t>
                             </w:r>
-                            <w:proofErr w:type="gramEnd"/>
                             <w:r>
                               <w:rPr>
                                 <w:spacing w:val="46"/>
@@ -5231,21 +5186,12 @@
                               </w:rPr>
                               <w:t xml:space="preserve"> </w:t>
                             </w:r>
-                            <w:proofErr w:type="gramStart"/>
                             <w:r>
                               <w:rPr>
                                 <w:w w:val="125"/>
                                 <w:sz w:val="20"/>
                               </w:rPr>
-                              <w:t>sys</w:t>
-                            </w:r>
-                            <w:proofErr w:type="gramEnd"/>
-                            <w:r>
-                              <w:rPr>
-                                <w:w w:val="125"/>
-                                <w:sz w:val="20"/>
-                              </w:rPr>
-                              <w:t xml:space="preserve"> </w:t>
+                              <w:t xml:space="preserve">sys </w:t>
                             </w:r>
                             <w:r>
                               <w:rPr>
@@ -5549,23 +5495,13 @@
                               </w:rPr>
                               <w:t xml:space="preserve"> </w:t>
                             </w:r>
-                            <w:proofErr w:type="spellStart"/>
                             <w:r>
                               <w:rPr>
                                 <w:spacing w:val="17"/>
                                 <w:w w:val="145"/>
                                 <w:sz w:val="20"/>
                               </w:rPr>
-                              <w:t>findall</w:t>
-                            </w:r>
-                            <w:proofErr w:type="spellEnd"/>
-                            <w:r>
-                              <w:rPr>
-                                <w:spacing w:val="17"/>
-                                <w:w w:val="145"/>
-                                <w:sz w:val="20"/>
-                              </w:rPr>
-                              <w:t>(</w:t>
+                              <w:t>findall(</w:t>
                             </w:r>
                             <w:r>
                               <w:rPr>
@@ -5917,7 +5853,6 @@
                           <w:sz w:val="20"/>
                         </w:rPr>
                       </w:pPr>
-                      <w:proofErr w:type="gramStart"/>
                       <w:r>
                         <w:rPr>
                           <w:spacing w:val="14"/>
@@ -5926,7 +5861,6 @@
                         </w:rPr>
                         <w:t>import</w:t>
                       </w:r>
-                      <w:proofErr w:type="gramEnd"/>
                       <w:r>
                         <w:rPr>
                           <w:spacing w:val="46"/>
@@ -5935,21 +5869,12 @@
                         </w:rPr>
                         <w:t xml:space="preserve"> </w:t>
                       </w:r>
-                      <w:proofErr w:type="gramStart"/>
                       <w:r>
                         <w:rPr>
                           <w:w w:val="125"/>
                           <w:sz w:val="20"/>
                         </w:rPr>
-                        <w:t>sys</w:t>
-                      </w:r>
-                      <w:proofErr w:type="gramEnd"/>
-                      <w:r>
-                        <w:rPr>
-                          <w:w w:val="125"/>
-                          <w:sz w:val="20"/>
-                        </w:rPr>
-                        <w:t xml:space="preserve"> </w:t>
+                        <w:t xml:space="preserve">sys </w:t>
                       </w:r>
                       <w:r>
                         <w:rPr>
@@ -6253,23 +6178,13 @@
                         </w:rPr>
                         <w:t xml:space="preserve"> </w:t>
                       </w:r>
-                      <w:proofErr w:type="spellStart"/>
                       <w:r>
                         <w:rPr>
                           <w:spacing w:val="17"/>
                           <w:w w:val="145"/>
                           <w:sz w:val="20"/>
                         </w:rPr>
-                        <w:t>findall</w:t>
-                      </w:r>
-                      <w:proofErr w:type="spellEnd"/>
-                      <w:r>
-                        <w:rPr>
-                          <w:spacing w:val="17"/>
-                          <w:w w:val="145"/>
-                          <w:sz w:val="20"/>
-                        </w:rPr>
-                        <w:t>(</w:t>
+                        <w:t>findall(</w:t>
                       </w:r>
                       <w:r>
                         <w:rPr>
@@ -7368,7 +7283,6 @@
         <w:spacing w:before="242"/>
         <w:ind w:left="453"/>
       </w:pPr>
-      <w:proofErr w:type="gramStart"/>
       <w:r>
         <w:rPr>
           <w:spacing w:val="-4"/>
@@ -7376,7 +7290,6 @@
         </w:rPr>
         <w:t>sort</w:t>
       </w:r>
-      <w:proofErr w:type="gramEnd"/>
     </w:p>
     <w:p>
       <w:pPr>
@@ -7739,21 +7652,12 @@
         </w:rPr>
         <w:t xml:space="preserve"> </w:t>
       </w:r>
-      <w:proofErr w:type="gramStart"/>
       <w:r>
         <w:rPr>
           <w:spacing w:val="-2"/>
           <w:w w:val="110"/>
         </w:rPr>
-        <w:t>counts</w:t>
-      </w:r>
-      <w:proofErr w:type="gramEnd"/>
-      <w:r>
-        <w:rPr>
-          <w:spacing w:val="-2"/>
-          <w:w w:val="110"/>
-        </w:rPr>
-        <w:t>?</w:t>
+        <w:t>counts?</w:t>
       </w:r>
     </w:p>
     <w:p>
@@ -7904,15 +7808,7 @@
         </w:rPr>
       </w:pPr>
       <w:r>
-        <w:t xml:space="preserve">Equal keys come one after another. </w:t>
-      </w:r>
-      <w:proofErr w:type="gramStart"/>
-      <w:r>
-        <w:t>So</w:t>
-      </w:r>
-      <w:proofErr w:type="gramEnd"/>
-      <w:r>
-        <w:t xml:space="preserve"> the reducer only compares each word with the previous one and keeps just one word and one count in memory</w:t>
+        <w:t>Equal keys come one after another. So the reducer only compares each word with the previous one and keeps just one word and one count in memory</w:t>
       </w:r>
     </w:p>
     <w:p>
@@ -8083,7 +7979,6 @@
                                 <w:sz w:val="20"/>
                               </w:rPr>
                             </w:pPr>
-                            <w:proofErr w:type="spellStart"/>
                             <w:r>
                               <w:rPr>
                                 <w:spacing w:val="17"/>
@@ -8092,7 +7987,6 @@
                               </w:rPr>
                               <w:t>current_word</w:t>
                             </w:r>
-                            <w:proofErr w:type="spellEnd"/>
                             <w:r>
                               <w:rPr>
                                 <w:spacing w:val="67"/>
@@ -8116,7 +8010,6 @@
                               </w:rPr>
                               <w:t xml:space="preserve"> </w:t>
                             </w:r>
-                            <w:proofErr w:type="gramStart"/>
                             <w:r>
                               <w:rPr>
                                 <w:spacing w:val="12"/>
@@ -8125,25 +8018,14 @@
                               </w:rPr>
                               <w:t xml:space="preserve">None </w:t>
                             </w:r>
-                            <w:proofErr w:type="spellStart"/>
                             <w:r>
                               <w:rPr>
                                 <w:spacing w:val="17"/>
                                 <w:w w:val="110"/>
                                 <w:sz w:val="20"/>
                               </w:rPr>
-                              <w:t>current</w:t>
+                              <w:t>current_count</w:t>
                             </w:r>
-                            <w:proofErr w:type="gramEnd"/>
-                            <w:r>
-                              <w:rPr>
-                                <w:spacing w:val="17"/>
-                                <w:w w:val="110"/>
-                                <w:sz w:val="20"/>
-                              </w:rPr>
-                              <w:t>_count</w:t>
-                            </w:r>
-                            <w:proofErr w:type="spellEnd"/>
                             <w:r>
                               <w:rPr>
                                 <w:spacing w:val="80"/>
@@ -8590,7 +8472,6 @@
                               </w:rPr>
                               <w:t xml:space="preserve"> </w:t>
                             </w:r>
-                            <w:proofErr w:type="spellStart"/>
                             <w:r>
                               <w:rPr>
                                 <w:spacing w:val="17"/>
@@ -8599,7 +8480,6 @@
                               </w:rPr>
                               <w:t>current_word</w:t>
                             </w:r>
-                            <w:proofErr w:type="spellEnd"/>
                             <w:r>
                               <w:rPr>
                                 <w:spacing w:val="-25"/>
@@ -8809,7 +8689,6 @@
                               </w:rPr>
                               <w:t xml:space="preserve"> </w:t>
                             </w:r>
-                            <w:proofErr w:type="gramStart"/>
                             <w:r>
                               <w:rPr>
                                 <w:i/>
@@ -8819,7 +8698,6 @@
                               </w:rPr>
                               <w:t>word</w:t>
                             </w:r>
-                            <w:proofErr w:type="gramEnd"/>
                             <w:r>
                               <w:rPr>
                                 <w:i/>
@@ -9164,7 +9042,6 @@
                           <w:sz w:val="20"/>
                         </w:rPr>
                       </w:pPr>
-                      <w:proofErr w:type="spellStart"/>
                       <w:r>
                         <w:rPr>
                           <w:spacing w:val="17"/>
@@ -9173,7 +9050,6 @@
                         </w:rPr>
                         <w:t>current_word</w:t>
                       </w:r>
-                      <w:proofErr w:type="spellEnd"/>
                       <w:r>
                         <w:rPr>
                           <w:spacing w:val="67"/>
@@ -9197,7 +9073,6 @@
                         </w:rPr>
                         <w:t xml:space="preserve"> </w:t>
                       </w:r>
-                      <w:proofErr w:type="gramStart"/>
                       <w:r>
                         <w:rPr>
                           <w:spacing w:val="12"/>
@@ -9206,25 +9081,14 @@
                         </w:rPr>
                         <w:t xml:space="preserve">None </w:t>
                       </w:r>
-                      <w:proofErr w:type="spellStart"/>
                       <w:r>
                         <w:rPr>
                           <w:spacing w:val="17"/>
                           <w:w w:val="110"/>
                           <w:sz w:val="20"/>
                         </w:rPr>
-                        <w:t>current</w:t>
+                        <w:t>current_count</w:t>
                       </w:r>
-                      <w:proofErr w:type="gramEnd"/>
-                      <w:r>
-                        <w:rPr>
-                          <w:spacing w:val="17"/>
-                          <w:w w:val="110"/>
-                          <w:sz w:val="20"/>
-                        </w:rPr>
-                        <w:t>_count</w:t>
-                      </w:r>
-                      <w:proofErr w:type="spellEnd"/>
                       <w:r>
                         <w:rPr>
                           <w:spacing w:val="80"/>
@@ -9671,7 +9535,6 @@
                         </w:rPr>
                         <w:t xml:space="preserve"> </w:t>
                       </w:r>
-                      <w:proofErr w:type="spellStart"/>
                       <w:r>
                         <w:rPr>
                           <w:spacing w:val="17"/>
@@ -9680,7 +9543,6 @@
                         </w:rPr>
                         <w:t>current_word</w:t>
                       </w:r>
-                      <w:proofErr w:type="spellEnd"/>
                       <w:r>
                         <w:rPr>
                           <w:spacing w:val="-25"/>
@@ -9890,7 +9752,6 @@
                         </w:rPr>
                         <w:t xml:space="preserve"> </w:t>
                       </w:r>
-                      <w:proofErr w:type="gramStart"/>
                       <w:r>
                         <w:rPr>
                           <w:i/>
@@ -9900,7 +9761,6 @@
                         </w:rPr>
                         <w:t>word</w:t>
                       </w:r>
-                      <w:proofErr w:type="gramEnd"/>
                       <w:r>
                         <w:rPr>
                           <w:i/>
@@ -10839,7 +10699,6 @@
         </w:rPr>
         <w:t xml:space="preserve"> </w:t>
       </w:r>
-      <w:proofErr w:type="gramStart"/>
       <w:r>
         <w:rPr>
           <w:w w:val="105"/>
@@ -10871,15 +10730,7 @@
           <w:spacing w:val="-2"/>
           <w:w w:val="105"/>
         </w:rPr>
-        <w:t>result</w:t>
-      </w:r>
-      <w:proofErr w:type="gramEnd"/>
-      <w:r>
-        <w:rPr>
-          <w:spacing w:val="-2"/>
-          <w:w w:val="105"/>
-        </w:rPr>
-        <w:t>:</w:t>
+        <w:t>result:</w:t>
       </w:r>
     </w:p>
     <w:p>
@@ -11204,7 +11055,6 @@
         <w:spacing w:before="242" w:line="242" w:lineRule="auto"/>
         <w:ind w:left="453" w:right="7706"/>
       </w:pPr>
-      <w:proofErr w:type="gramStart"/>
       <w:r>
         <w:rPr>
           <w:w w:val="115"/>
@@ -11225,7 +11075,6 @@
         </w:rPr>
         <w:t>blue</w:t>
       </w:r>
-      <w:proofErr w:type="gramEnd"/>
       <w:r>
         <w:rPr>
           <w:spacing w:val="40"/>
@@ -11237,16 +11086,8 @@
         <w:rPr>
           <w:w w:val="115"/>
         </w:rPr>
-        <w:t xml:space="preserve">red </w:t>
-      </w:r>
-      <w:proofErr w:type="gramStart"/>
-      <w:r>
-        <w:rPr>
-          <w:w w:val="115"/>
-        </w:rPr>
-        <w:t>blue</w:t>
-      </w:r>
-      <w:proofErr w:type="gramEnd"/>
+        <w:t>red blue</w:t>
+      </w:r>
       <w:r>
         <w:rPr>
           <w:spacing w:val="40"/>
@@ -11267,7 +11108,6 @@
         <w:spacing w:line="268" w:lineRule="exact"/>
         <w:ind w:left="453"/>
       </w:pPr>
-      <w:proofErr w:type="gramStart"/>
       <w:r>
         <w:rPr>
           <w:w w:val="115"/>
@@ -11287,7 +11127,6 @@
         </w:rPr>
         <w:t>green</w:t>
       </w:r>
-      <w:proofErr w:type="gramEnd"/>
       <w:r>
         <w:rPr>
           <w:spacing w:val="43"/>
@@ -12307,13 +12146,8 @@
         <w:spacing w:before="165"/>
       </w:pPr>
       <w:r>
-        <w:t xml:space="preserve">Shuffle and </w:t>
-      </w:r>
-      <w:proofErr w:type="gramStart"/>
-      <w:r>
-        <w:t>sort</w:t>
-      </w:r>
-      <w:proofErr w:type="gramEnd"/>
+        <w:t>Shuffle and sort</w:t>
+      </w:r>
     </w:p>
     <w:p>
       <w:pPr>
@@ -12376,15 +12210,7 @@
         <w:spacing w:before="164"/>
       </w:pPr>
       <w:r>
-        <w:t xml:space="preserve">No. The reducer starts only after all mapper outputs for its keys are ready. </w:t>
-      </w:r>
-      <w:proofErr w:type="gramStart"/>
-      <w:r>
-        <w:t>Otherwise</w:t>
-      </w:r>
-      <w:proofErr w:type="gramEnd"/>
-      <w:r>
-        <w:t xml:space="preserve"> the count would be incomplete</w:t>
+        <w:t>No. The reducer starts only after all mapper outputs for its keys are ready. Otherwise the count would be incomplete</w:t>
       </w:r>
     </w:p>
     <w:p>
@@ -12687,14 +12513,12 @@
         </w:rPr>
         <w:t xml:space="preserve"> </w:t>
       </w:r>
-      <w:proofErr w:type="spellStart"/>
       <w:r>
         <w:rPr>
           <w:w w:val="115"/>
         </w:rPr>
         <w:t>data</w:t>
       </w:r>
-      <w:proofErr w:type="spellEnd"/>
       <w:r>
         <w:rPr>
           <w:spacing w:val="69"/>
@@ -13764,7 +13588,6 @@
           <w:w w:val="120"/>
         </w:rPr>
       </w:pPr>
-      <w:proofErr w:type="spellStart"/>
       <w:r>
         <w:rPr>
           <w:spacing w:val="-2"/>
@@ -13772,7 +13595,6 @@
         </w:rPr>
         <w:t>wc</w:t>
       </w:r>
-      <w:proofErr w:type="spellEnd"/>
       <w:r>
         <w:rPr>
           <w:spacing w:val="-1"/>
@@ -13801,14 +13623,12 @@
         </w:rPr>
         <w:t xml:space="preserve">map_output.txt </w:t>
       </w:r>
-      <w:proofErr w:type="spellStart"/>
       <w:r>
         <w:rPr>
           <w:w w:val="120"/>
         </w:rPr>
         <w:t>wc</w:t>
       </w:r>
-      <w:proofErr w:type="spellEnd"/>
       <w:r>
         <w:rPr>
           <w:w w:val="165"/>
@@ -14013,15 +13833,7 @@
         <w:spacing w:before="242"/>
       </w:pPr>
       <w:r>
-        <w:t xml:space="preserve">No. </w:t>
-      </w:r>
-      <w:proofErr w:type="gramStart"/>
-      <w:r>
-        <w:t>The final result</w:t>
-      </w:r>
-      <w:proofErr w:type="gramEnd"/>
-      <w:r>
-        <w:t xml:space="preserve"> is data 4, science 3, the same as without a combiner</w:t>
+        <w:t>No. The final result is data 4, science 3, the same as without a combiner</w:t>
       </w:r>
     </w:p>
     <w:p>
@@ -14290,15 +14102,7 @@
         </w:tabs>
       </w:pPr>
       <w:r>
-        <w:t xml:space="preserve">Intermediate data is sent over the network from mappers to reducers. Fewer records </w:t>
-      </w:r>
-      <w:proofErr w:type="gramStart"/>
-      <w:r>
-        <w:t>means</w:t>
-      </w:r>
-      <w:proofErr w:type="gramEnd"/>
-      <w:r>
-        <w:t xml:space="preserve"> less data to send, so the transfer takes less time</w:t>
+        <w:t>Intermediate data is sent over the network from mappers to reducers. Fewer records means less data to send, so the transfer takes less time</w:t>
       </w:r>
     </w:p>
     <w:p>
@@ -14432,15 +14236,7 @@
         </w:tabs>
       </w:pPr>
       <w:r>
-        <w:t xml:space="preserve">Addition gives the same result in any order and grouping: (1 + 1 + 1) + 1 = 1 + 1 + 1 + 1. </w:t>
-      </w:r>
-      <w:proofErr w:type="gramStart"/>
-      <w:r>
-        <w:t>So</w:t>
-      </w:r>
-      <w:proofErr w:type="gramEnd"/>
-      <w:r>
-        <w:t xml:space="preserve"> adding partial sums first does not change the total</w:t>
+        <w:t>Addition gives the same result in any order and grouping: (1 + 1 + 1) + 1 = 1 + 1 + 1 + 1. So adding partial sums first does not change the total</w:t>
       </w:r>
     </w:p>
     <w:p>
@@ -14936,8 +14732,6 @@
                                 <w:sz w:val="16"/>
                               </w:rPr>
                             </w:pPr>
-                            <w:proofErr w:type="spellStart"/>
-                            <w:proofErr w:type="gramStart"/>
                             <w:r>
                               <w:rPr>
                                 <w:i/>
@@ -14962,8 +14756,6 @@
                               </w:rPr>
                               <w:t>k</w:t>
                             </w:r>
-                            <w:proofErr w:type="spellEnd"/>
-                            <w:proofErr w:type="gramEnd"/>
                           </w:p>
                         </w:txbxContent>
                       </wps:txbx>
@@ -14989,8 +14781,6 @@
                           <w:sz w:val="16"/>
                         </w:rPr>
                       </w:pPr>
-                      <w:proofErr w:type="spellStart"/>
-                      <w:proofErr w:type="gramStart"/>
                       <w:r>
                         <w:rPr>
                           <w:i/>
@@ -15015,8 +14805,6 @@
                         </w:rPr>
                         <w:t>k</w:t>
                       </w:r>
-                      <w:proofErr w:type="spellEnd"/>
-                      <w:proofErr w:type="gramEnd"/>
                     </w:p>
                   </w:txbxContent>
                 </v:textbox>
@@ -15158,7 +14946,6 @@
       <w:pPr>
         <w:pStyle w:val="a3"/>
         <w:spacing w:before="83" w:line="242" w:lineRule="auto"/>
-        <w:ind w:left="792"/>
       </w:pPr>
       <w:r>
         <w:drawing>
@@ -15482,11 +15269,9 @@
               <w:pStyle w:val="a3"/>
               <w:spacing w:line="242" w:lineRule="auto"/>
             </w:pPr>
-            <w:proofErr w:type="spellStart"/>
             <w:r>
               <w:t>hadoop</w:t>
             </w:r>
-            <w:proofErr w:type="spellEnd"/>
           </w:p>
         </w:tc>
         <w:tc>
@@ -15601,21 +15386,7 @@
         <w:rPr>
           <w:w w:val="105"/>
         </w:rPr>
-        <w:t xml:space="preserve">Can the same intermediate key be sent to two different reducers </w:t>
-      </w:r>
-      <w:proofErr w:type="gramStart"/>
-      <w:r>
-        <w:rPr>
-          <w:w w:val="105"/>
-        </w:rPr>
-        <w:t>in</w:t>
-      </w:r>
-      <w:proofErr w:type="gramEnd"/>
-      <w:r>
-        <w:rPr>
-          <w:w w:val="105"/>
-        </w:rPr>
-        <w:t xml:space="preserve"> a normal per-key reduc</w:t>
+        <w:t>Can the same intermediate key be sent to two different reducers in a normal per-key reduc</w:t>
       </w:r>
       <w:r>
         <w:rPr>
@@ -15989,7 +15760,6 @@
         </w:rPr>
         <w:t xml:space="preserve"> </w:t>
       </w:r>
-      <w:proofErr w:type="gramStart"/>
       <w:r>
         <w:rPr>
           <w:w w:val="105"/>
@@ -16022,7 +15792,6 @@
         </w:rPr>
         <w:t>same</w:t>
       </w:r>
-      <w:proofErr w:type="gramEnd"/>
       <w:r>
         <w:rPr>
           <w:spacing w:val="9"/>
@@ -16445,14 +16214,12 @@
       <w:r>
         <w:tab/>
       </w:r>
-      <w:proofErr w:type="spellStart"/>
       <w:r>
         <w:rPr>
           <w:w w:val="115"/>
         </w:rPr>
         <w:t>mapreduce</w:t>
       </w:r>
-      <w:proofErr w:type="spellEnd"/>
       <w:r>
         <w:rPr>
           <w:spacing w:val="40"/>
@@ -17139,7 +16906,6 @@
         </w:rPr>
         <w:t xml:space="preserve"> </w:t>
       </w:r>
-      <w:proofErr w:type="gramStart"/>
       <w:r>
         <w:rPr>
           <w:w w:val="105"/>
@@ -17158,15 +16924,7 @@
           <w:spacing w:val="-5"/>
           <w:w w:val="105"/>
         </w:rPr>
-        <w:t>to</w:t>
-      </w:r>
-      <w:proofErr w:type="gramEnd"/>
-      <w:r>
-        <w:rPr>
-          <w:spacing w:val="-5"/>
-          <w:w w:val="105"/>
-        </w:rPr>
-        <w:t>:</w:t>
+        <w:t>to:</w:t>
       </w:r>
     </w:p>
     <w:p>
@@ -17394,6 +17152,43 @@
         <w:pStyle w:val="a3"/>
         <w:spacing w:before="25"/>
       </w:pPr>
+      <w:r>
+        <w:drawing>
+          <wp:inline distT="0" distB="0" distL="0" distR="0" wp14:anchorId="57A4855A" wp14:editId="2A346E1F">
+            <wp:extent cx="6303645" cy="4226560"/>
+            <wp:effectExtent l="0" t="0" r="1905" b="2540"/>
+            <wp:docPr id="1715229358" name="Рисунок 1"/>
+            <wp:cNvGraphicFramePr>
+              <a:graphicFrameLocks xmlns:a="http://schemas.openxmlformats.org/drawingml/2006/main" noChangeAspect="1"/>
+            </wp:cNvGraphicFramePr>
+            <a:graphic xmlns:a="http://schemas.openxmlformats.org/drawingml/2006/main">
+              <a:graphicData uri="http://schemas.openxmlformats.org/drawingml/2006/picture">
+                <pic:pic xmlns:pic="http://schemas.openxmlformats.org/drawingml/2006/picture">
+                  <pic:nvPicPr>
+                    <pic:cNvPr id="1715229358" name=""/>
+                    <pic:cNvPicPr/>
+                  </pic:nvPicPr>
+                  <pic:blipFill>
+                    <a:blip r:embed="rId14"/>
+                    <a:stretch>
+                      <a:fillRect/>
+                    </a:stretch>
+                  </pic:blipFill>
+                  <pic:spPr>
+                    <a:xfrm>
+                      <a:off x="0" y="0"/>
+                      <a:ext cx="6303645" cy="4226560"/>
+                    </a:xfrm>
+                    <a:prstGeom prst="rect">
+                      <a:avLst/>
+                    </a:prstGeom>
+                  </pic:spPr>
+                </pic:pic>
+              </a:graphicData>
+            </a:graphic>
+          </wp:inline>
+        </w:drawing>
+      </w:r>
     </w:p>
     <w:p>
       <w:pPr>
@@ -17521,6 +17316,17 @@
     </w:p>
     <w:p>
       <w:pPr>
+        <w:tabs>
+          <w:tab w:val="left" w:pos="998"/>
+        </w:tabs>
+        <w:spacing w:before="138"/>
+      </w:pPr>
+      <w:r>
+        <w:t>The word</w:t>
+      </w:r>
+    </w:p>
+    <w:p>
+      <w:pPr>
         <w:pStyle w:val="a5"/>
         <w:numPr>
           <w:ilvl w:val="0"/>
@@ -17593,6 +17399,16 @@
     </w:p>
     <w:p>
       <w:pPr>
+        <w:tabs>
+          <w:tab w:val="left" w:pos="998"/>
+        </w:tabs>
+      </w:pPr>
+      <w:r>
+        <w:t>The document ID, for example doc1</w:t>
+      </w:r>
+    </w:p>
+    <w:p>
+      <w:pPr>
         <w:pStyle w:val="a5"/>
         <w:numPr>
           <w:ilvl w:val="0"/>
@@ -17720,6 +17536,16 @@
     </w:p>
     <w:p>
       <w:pPr>
+        <w:tabs>
+          <w:tab w:val="left" w:pos="998"/>
+        </w:tabs>
+      </w:pPr>
+      <w:r>
+        <w:t>The reducer builds the full list of documents for one word. If one word went to two reducers, each would give only part of the list, for example data doc2 on one reducer and data doc3,doc4 on the other</w:t>
+      </w:r>
+    </w:p>
+    <w:p>
+      <w:pPr>
         <w:pStyle w:val="a5"/>
         <w:numPr>
           <w:ilvl w:val="0"/>
@@ -17831,6 +17657,16 @@
     </w:p>
     <w:p>
       <w:pPr>
+        <w:tabs>
+          <w:tab w:val="left" w:pos="998"/>
+        </w:tabs>
+      </w:pPr>
+      <w:r>
+        <w:t>In Word Count the value is 1 and the reducer adds numbers. Here the value is a document ID, and the reducer collects a list of unique IDs instead of a sum</w:t>
+      </w:r>
+    </w:p>
+    <w:p>
+      <w:pPr>
         <w:pStyle w:val="a3"/>
         <w:spacing w:before="93"/>
       </w:pPr>
@@ -18137,6 +17973,7 @@
           <w:noProof/>
           <w:sz w:val="17"/>
         </w:rPr>
+        <w:lastRenderedPageBreak/>
         <mc:AlternateContent>
           <mc:Choice Requires="wpg">
             <w:drawing>
@@ -19344,11 +19181,9 @@
         </w:rPr>
         <w:t xml:space="preserve"> </w:t>
       </w:r>
-      <w:proofErr w:type="gramStart"/>
       <w:r>
         <w:t>reduce</w:t>
       </w:r>
-      <w:proofErr w:type="gramEnd"/>
       <w:r>
         <w:rPr>
           <w:spacing w:val="31"/>
@@ -20203,21 +20038,12 @@
         </w:rPr>
         <w:t xml:space="preserve"> </w:t>
       </w:r>
-      <w:proofErr w:type="spellStart"/>
       <w:r>
         <w:rPr>
           <w:spacing w:val="-2"/>
           <w:w w:val="105"/>
         </w:rPr>
-        <w:t>NameNode</w:t>
-      </w:r>
-      <w:proofErr w:type="spellEnd"/>
-      <w:r>
-        <w:rPr>
-          <w:spacing w:val="-2"/>
-          <w:w w:val="105"/>
-        </w:rPr>
-        <w:t>?</w:t>
+        <w:t>NameNode?</w:t>
       </w:r>
     </w:p>
     <w:p>
@@ -20335,21 +20161,12 @@
         </w:rPr>
         <w:t xml:space="preserve"> </w:t>
       </w:r>
-      <w:proofErr w:type="spellStart"/>
       <w:r>
         <w:rPr>
           <w:spacing w:val="-2"/>
           <w:w w:val="105"/>
         </w:rPr>
-        <w:t>DataNode</w:t>
-      </w:r>
-      <w:proofErr w:type="spellEnd"/>
-      <w:r>
-        <w:rPr>
-          <w:spacing w:val="-2"/>
-          <w:w w:val="105"/>
-        </w:rPr>
-        <w:t>?</w:t>
+        <w:t>DataNode?</w:t>
       </w:r>
     </w:p>
     <w:p>
@@ -20383,11 +20200,9 @@
         </w:rPr>
         <w:t xml:space="preserve"> </w:t>
       </w:r>
-      <w:proofErr w:type="spellStart"/>
       <w:r>
         <w:t>NameNode</w:t>
       </w:r>
-      <w:proofErr w:type="spellEnd"/>
       <w:r>
         <w:rPr>
           <w:spacing w:val="27"/>
@@ -22004,7 +21819,7 @@
           </mc:Choice>
           <mc:Fallback>
             <w:pict>
-              <v:shape w14:anchorId="28AD6C2D" id="Graphic 40" o:spid="_x0000_s1026" style="position:absolute;margin-left:121.8pt;margin-top:19.4pt;width:3.45pt;height:.1pt;z-index:-15977472;visibility:visible;mso-wrap-style:square;mso-wrap-distance-left:0;mso-wrap-distance-top:0;mso-wrap-distance-right:0;mso-wrap-distance-bottom:0;mso-position-horizontal:absolute;mso-position-horizontal-relative:page;mso-position-vertical:absolute;mso-position-vertical-relative:text;v-text-anchor:top" coordsize="43815,1270" o:gfxdata="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" path="m,l43637,e" filled="f" strokeweight=".14039mm">
+              <v:shape w14:anchorId="7DB2FD4E" id="Graphic 40" o:spid="_x0000_s1026" style="position:absolute;margin-left:121.8pt;margin-top:19.4pt;width:3.45pt;height:.1pt;z-index:-15977472;visibility:visible;mso-wrap-style:square;mso-wrap-distance-left:0;mso-wrap-distance-top:0;mso-wrap-distance-right:0;mso-wrap-distance-bottom:0;mso-position-horizontal:absolute;mso-position-horizontal-relative:page;mso-position-vertical:absolute;mso-position-vertical-relative:text;v-text-anchor:top" coordsize="43815,1270" o:gfxdata="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" path="m,l43637,e" filled="f" strokeweight=".14039mm">
                 <v:path arrowok="t"/>
                 <w10:wrap anchorx="page"/>
               </v:shape>
@@ -22118,7 +21933,7 @@
           </mc:Choice>
           <mc:Fallback>
             <w:pict>
-              <v:shape w14:anchorId="6A6847DF" id="Graphic 41" o:spid="_x0000_s1026" style="position:absolute;margin-left:121.8pt;margin-top:19.35pt;width:3.45pt;height:.1pt;z-index:-15976960;visibility:visible;mso-wrap-style:square;mso-wrap-distance-left:0;mso-wrap-distance-top:0;mso-wrap-distance-right:0;mso-wrap-distance-bottom:0;mso-position-horizontal:absolute;mso-position-horizontal-relative:page;mso-position-vertical:absolute;mso-position-vertical-relative:text;v-text-anchor:top" coordsize="43815,1270" o:gfxdata="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" path="m,l43637,e" filled="f" strokeweight=".14039mm">
+              <v:shape w14:anchorId="67774DA2" id="Graphic 41" o:spid="_x0000_s1026" style="position:absolute;margin-left:121.8pt;margin-top:19.35pt;width:3.45pt;height:.1pt;z-index:-15976960;visibility:visible;mso-wrap-style:square;mso-wrap-distance-left:0;mso-wrap-distance-top:0;mso-wrap-distance-right:0;mso-wrap-distance-bottom:0;mso-position-horizontal:absolute;mso-position-horizontal-relative:page;mso-position-vertical:absolute;mso-position-vertical-relative:text;v-text-anchor:top" coordsize="43815,1270" o:gfxdata="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" path="m,l43637,e" filled="f" strokeweight=".14039mm">
                 <v:path arrowok="t"/>
                 <w10:wrap anchorx="page"/>
               </v:shape>

</xml_diff>

<commit_message>
Part 8: data locality and HDFS
</commit_message>
<xml_diff>
--- a/Lab6_AbdanurAyazbek_BDA2406.docx
+++ b/Lab6_AbdanurAyazbek_BDA2406.docx
@@ -6,6 +6,7 @@
       <w:pPr>
         <w:pStyle w:val="a4"/>
       </w:pPr>
+      <w:proofErr w:type="gramStart"/>
       <w:r>
         <w:rPr>
           <w:w w:val="120"/>
@@ -25,6 +26,7 @@
         </w:rPr>
         <w:t>Performance</w:t>
       </w:r>
+      <w:proofErr w:type="gramEnd"/>
       <w:r>
         <w:rPr>
           <w:spacing w:val="27"/>
@@ -323,12 +325,14 @@
         </w:rPr>
         <w:t xml:space="preserve"> </w:t>
       </w:r>
+      <w:proofErr w:type="gramStart"/>
       <w:r>
         <w:rPr>
           <w:w w:val="110"/>
         </w:rPr>
         <w:t>sort</w:t>
       </w:r>
+      <w:proofErr w:type="gramEnd"/>
       <w:r>
         <w:rPr>
           <w:spacing w:val="18"/>
@@ -892,12 +896,14 @@
         <w:spacing w:before="242"/>
         <w:ind w:left="453"/>
       </w:pPr>
+      <w:proofErr w:type="gramStart"/>
       <w:r>
         <w:rPr>
           <w:w w:val="120"/>
         </w:rPr>
         <w:t>brew</w:t>
       </w:r>
+      <w:proofErr w:type="gramEnd"/>
       <w:r>
         <w:rPr>
           <w:spacing w:val="54"/>
@@ -918,6 +924,7 @@
         </w:rPr>
         <w:t xml:space="preserve"> </w:t>
       </w:r>
+      <w:proofErr w:type="gramStart"/>
       <w:r>
         <w:rPr>
           <w:spacing w:val="-2"/>
@@ -925,6 +932,7 @@
         </w:rPr>
         <w:t>python</w:t>
       </w:r>
+      <w:proofErr w:type="gramEnd"/>
     </w:p>
     <w:p>
       <w:pPr>
@@ -2733,12 +2741,14 @@
         </w:rPr>
         <w:t xml:space="preserve"> </w:t>
       </w:r>
+      <w:proofErr w:type="gramStart"/>
       <w:r>
         <w:rPr>
           <w:w w:val="105"/>
         </w:rPr>
         <w:t>having</w:t>
       </w:r>
+      <w:proofErr w:type="gramEnd"/>
       <w:r>
         <w:rPr>
           <w:spacing w:val="9"/>
@@ -3277,6 +3287,7 @@
                               </w:rPr>
                             </w:pPr>
                             <w:proofErr w:type="spellStart"/>
+                            <w:proofErr w:type="gramStart"/>
                             <w:r>
                               <w:rPr>
                                 <w:i/>
@@ -3287,6 +3298,7 @@
                               <w:t>i</w:t>
                             </w:r>
                             <w:proofErr w:type="spellEnd"/>
+                            <w:proofErr w:type="gramEnd"/>
                           </w:p>
                         </w:txbxContent>
                       </wps:txbx>
@@ -3313,6 +3325,7 @@
                         </w:rPr>
                       </w:pPr>
                       <w:proofErr w:type="spellStart"/>
+                      <w:proofErr w:type="gramStart"/>
                       <w:r>
                         <w:rPr>
                           <w:i/>
@@ -3323,6 +3336,7 @@
                         <w:t>i</w:t>
                       </w:r>
                       <w:proofErr w:type="spellEnd"/>
+                      <w:proofErr w:type="gramEnd"/>
                     </w:p>
                   </w:txbxContent>
                 </v:textbox>
@@ -4028,8 +4042,29 @@
           <w:tab w:val="left" w:pos="998"/>
         </w:tabs>
       </w:pPr>
-      <w:r>
-        <w:t>Collects the pairs from all mappers, puts pairs with the same key into one group and sorts the groups by key. Each group goes to its reducer</w:t>
+      <w:proofErr w:type="gramStart"/>
+      <w:r>
+        <w:t>Collects</w:t>
+      </w:r>
+      <w:proofErr w:type="gramEnd"/>
+      <w:r>
+        <w:t xml:space="preserve"> the pairs from all mappers, </w:t>
+      </w:r>
+      <w:proofErr w:type="gramStart"/>
+      <w:r>
+        <w:t>puts</w:t>
+      </w:r>
+      <w:proofErr w:type="gramEnd"/>
+      <w:r>
+        <w:t xml:space="preserve"> pairs with the same key into one group and </w:t>
+      </w:r>
+      <w:proofErr w:type="gramStart"/>
+      <w:r>
+        <w:t>sorts</w:t>
+      </w:r>
+      <w:proofErr w:type="gramEnd"/>
+      <w:r>
+        <w:t xml:space="preserve"> the groups by key. Each group goes to its reducer</w:t>
       </w:r>
     </w:p>
     <w:p>
@@ -5178,6 +5213,7 @@
                                 <w:sz w:val="20"/>
                               </w:rPr>
                             </w:pPr>
+                            <w:proofErr w:type="gramStart"/>
                             <w:r>
                               <w:rPr>
                                 <w:spacing w:val="14"/>
@@ -5186,6 +5222,7 @@
                               </w:rPr>
                               <w:t>import</w:t>
                             </w:r>
+                            <w:proofErr w:type="gramEnd"/>
                             <w:r>
                               <w:rPr>
                                 <w:spacing w:val="46"/>
@@ -5194,12 +5231,21 @@
                               </w:rPr>
                               <w:t xml:space="preserve"> </w:t>
                             </w:r>
+                            <w:proofErr w:type="gramStart"/>
                             <w:r>
                               <w:rPr>
                                 <w:w w:val="125"/>
                                 <w:sz w:val="20"/>
                               </w:rPr>
-                              <w:t xml:space="preserve">sys </w:t>
+                              <w:t>sys</w:t>
+                            </w:r>
+                            <w:proofErr w:type="gramEnd"/>
+                            <w:r>
+                              <w:rPr>
+                                <w:w w:val="125"/>
+                                <w:sz w:val="20"/>
+                              </w:rPr>
+                              <w:t xml:space="preserve"> </w:t>
                             </w:r>
                             <w:r>
                               <w:rPr>
@@ -5871,6 +5917,7 @@
                           <w:sz w:val="20"/>
                         </w:rPr>
                       </w:pPr>
+                      <w:proofErr w:type="gramStart"/>
                       <w:r>
                         <w:rPr>
                           <w:spacing w:val="14"/>
@@ -5879,6 +5926,7 @@
                         </w:rPr>
                         <w:t>import</w:t>
                       </w:r>
+                      <w:proofErr w:type="gramEnd"/>
                       <w:r>
                         <w:rPr>
                           <w:spacing w:val="46"/>
@@ -5887,12 +5935,21 @@
                         </w:rPr>
                         <w:t xml:space="preserve"> </w:t>
                       </w:r>
+                      <w:proofErr w:type="gramStart"/>
                       <w:r>
                         <w:rPr>
                           <w:w w:val="125"/>
                           <w:sz w:val="20"/>
                         </w:rPr>
-                        <w:t xml:space="preserve">sys </w:t>
+                        <w:t>sys</w:t>
+                      </w:r>
+                      <w:proofErr w:type="gramEnd"/>
+                      <w:r>
+                        <w:rPr>
+                          <w:w w:val="125"/>
+                          <w:sz w:val="20"/>
+                        </w:rPr>
+                        <w:t xml:space="preserve"> </w:t>
                       </w:r>
                       <w:r>
                         <w:rPr>
@@ -7311,6 +7368,7 @@
         <w:spacing w:before="242"/>
         <w:ind w:left="453"/>
       </w:pPr>
+      <w:proofErr w:type="gramStart"/>
       <w:r>
         <w:rPr>
           <w:spacing w:val="-4"/>
@@ -7318,6 +7376,7 @@
         </w:rPr>
         <w:t>sort</w:t>
       </w:r>
+      <w:proofErr w:type="gramEnd"/>
     </w:p>
     <w:p>
       <w:pPr>
@@ -7680,12 +7739,21 @@
         </w:rPr>
         <w:t xml:space="preserve"> </w:t>
       </w:r>
+      <w:proofErr w:type="gramStart"/>
       <w:r>
         <w:rPr>
           <w:spacing w:val="-2"/>
           <w:w w:val="110"/>
         </w:rPr>
-        <w:t>counts?</w:t>
+        <w:t>counts</w:t>
+      </w:r>
+      <w:proofErr w:type="gramEnd"/>
+      <w:r>
+        <w:rPr>
+          <w:spacing w:val="-2"/>
+          <w:w w:val="110"/>
+        </w:rPr>
+        <w:t>?</w:t>
       </w:r>
     </w:p>
     <w:p>
@@ -7836,7 +7904,15 @@
         </w:rPr>
       </w:pPr>
       <w:r>
-        <w:t>Equal keys come one after another. So the reducer only compares each word with the previous one and keeps just one word and one count in memory</w:t>
+        <w:t xml:space="preserve">Equal keys come one after another. </w:t>
+      </w:r>
+      <w:proofErr w:type="gramStart"/>
+      <w:r>
+        <w:t>So</w:t>
+      </w:r>
+      <w:proofErr w:type="gramEnd"/>
+      <w:r>
+        <w:t xml:space="preserve"> the reducer only compares each word with the previous one and keeps just one word and one count in memory</w:t>
       </w:r>
     </w:p>
     <w:p>
@@ -8040,6 +8116,7 @@
                               </w:rPr>
                               <w:t xml:space="preserve"> </w:t>
                             </w:r>
+                            <w:proofErr w:type="gramStart"/>
                             <w:r>
                               <w:rPr>
                                 <w:spacing w:val="12"/>
@@ -8055,7 +8132,16 @@
                                 <w:w w:val="110"/>
                                 <w:sz w:val="20"/>
                               </w:rPr>
-                              <w:t>current_count</w:t>
+                              <w:t>current</w:t>
+                            </w:r>
+                            <w:proofErr w:type="gramEnd"/>
+                            <w:r>
+                              <w:rPr>
+                                <w:spacing w:val="17"/>
+                                <w:w w:val="110"/>
+                                <w:sz w:val="20"/>
+                              </w:rPr>
+                              <w:t>_count</w:t>
                             </w:r>
                             <w:proofErr w:type="spellEnd"/>
                             <w:r>
@@ -8723,6 +8809,7 @@
                               </w:rPr>
                               <w:t xml:space="preserve"> </w:t>
                             </w:r>
+                            <w:proofErr w:type="gramStart"/>
                             <w:r>
                               <w:rPr>
                                 <w:i/>
@@ -8732,6 +8819,7 @@
                               </w:rPr>
                               <w:t>word</w:t>
                             </w:r>
+                            <w:proofErr w:type="gramEnd"/>
                             <w:r>
                               <w:rPr>
                                 <w:i/>
@@ -9109,6 +9197,7 @@
                         </w:rPr>
                         <w:t xml:space="preserve"> </w:t>
                       </w:r>
+                      <w:proofErr w:type="gramStart"/>
                       <w:r>
                         <w:rPr>
                           <w:spacing w:val="12"/>
@@ -9124,7 +9213,16 @@
                           <w:w w:val="110"/>
                           <w:sz w:val="20"/>
                         </w:rPr>
-                        <w:t>current_count</w:t>
+                        <w:t>current</w:t>
+                      </w:r>
+                      <w:proofErr w:type="gramEnd"/>
+                      <w:r>
+                        <w:rPr>
+                          <w:spacing w:val="17"/>
+                          <w:w w:val="110"/>
+                          <w:sz w:val="20"/>
+                        </w:rPr>
+                        <w:t>_count</w:t>
                       </w:r>
                       <w:proofErr w:type="spellEnd"/>
                       <w:r>
@@ -9792,6 +9890,7 @@
                         </w:rPr>
                         <w:t xml:space="preserve"> </w:t>
                       </w:r>
+                      <w:proofErr w:type="gramStart"/>
                       <w:r>
                         <w:rPr>
                           <w:i/>
@@ -9801,6 +9900,7 @@
                         </w:rPr>
                         <w:t>word</w:t>
                       </w:r>
+                      <w:proofErr w:type="gramEnd"/>
                       <w:r>
                         <w:rPr>
                           <w:i/>
@@ -10739,6 +10839,7 @@
         </w:rPr>
         <w:t xml:space="preserve"> </w:t>
       </w:r>
+      <w:proofErr w:type="gramStart"/>
       <w:r>
         <w:rPr>
           <w:w w:val="105"/>
@@ -10770,7 +10871,15 @@
           <w:spacing w:val="-2"/>
           <w:w w:val="105"/>
         </w:rPr>
-        <w:t>result:</w:t>
+        <w:t>result</w:t>
+      </w:r>
+      <w:proofErr w:type="gramEnd"/>
+      <w:r>
+        <w:rPr>
+          <w:spacing w:val="-2"/>
+          <w:w w:val="105"/>
+        </w:rPr>
+        <w:t>:</w:t>
       </w:r>
     </w:p>
     <w:p>
@@ -11095,6 +11204,7 @@
         <w:spacing w:before="242" w:line="242" w:lineRule="auto"/>
         <w:ind w:left="453" w:right="7706"/>
       </w:pPr>
+      <w:proofErr w:type="gramStart"/>
       <w:r>
         <w:rPr>
           <w:w w:val="115"/>
@@ -11115,6 +11225,7 @@
         </w:rPr>
         <w:t>blue</w:t>
       </w:r>
+      <w:proofErr w:type="gramEnd"/>
       <w:r>
         <w:rPr>
           <w:spacing w:val="40"/>
@@ -11126,8 +11237,16 @@
         <w:rPr>
           <w:w w:val="115"/>
         </w:rPr>
-        <w:t>red blue</w:t>
-      </w:r>
+        <w:t xml:space="preserve">red </w:t>
+      </w:r>
+      <w:proofErr w:type="gramStart"/>
+      <w:r>
+        <w:rPr>
+          <w:w w:val="115"/>
+        </w:rPr>
+        <w:t>blue</w:t>
+      </w:r>
+      <w:proofErr w:type="gramEnd"/>
       <w:r>
         <w:rPr>
           <w:spacing w:val="40"/>
@@ -11148,6 +11267,7 @@
         <w:spacing w:line="268" w:lineRule="exact"/>
         <w:ind w:left="453"/>
       </w:pPr>
+      <w:proofErr w:type="gramStart"/>
       <w:r>
         <w:rPr>
           <w:w w:val="115"/>
@@ -11167,6 +11287,7 @@
         </w:rPr>
         <w:t>green</w:t>
       </w:r>
+      <w:proofErr w:type="gramEnd"/>
       <w:r>
         <w:rPr>
           <w:spacing w:val="43"/>
@@ -12186,8 +12307,13 @@
         <w:spacing w:before="165"/>
       </w:pPr>
       <w:r>
-        <w:t>Shuffle and sort</w:t>
-      </w:r>
+        <w:t xml:space="preserve">Shuffle and </w:t>
+      </w:r>
+      <w:proofErr w:type="gramStart"/>
+      <w:r>
+        <w:t>sort</w:t>
+      </w:r>
+      <w:proofErr w:type="gramEnd"/>
     </w:p>
     <w:p>
       <w:pPr>
@@ -12250,7 +12376,15 @@
         <w:spacing w:before="164"/>
       </w:pPr>
       <w:r>
-        <w:t>No. The reducer starts only after all mapper outputs for its keys are ready. Otherwise the count would be incomplete</w:t>
+        <w:t xml:space="preserve">No. The reducer starts only after all mapper outputs for its keys are ready. </w:t>
+      </w:r>
+      <w:proofErr w:type="gramStart"/>
+      <w:r>
+        <w:t>Otherwise</w:t>
+      </w:r>
+      <w:proofErr w:type="gramEnd"/>
+      <w:r>
+        <w:t xml:space="preserve"> the count would be incomplete</w:t>
       </w:r>
     </w:p>
     <w:p>
@@ -13879,7 +14013,15 @@
         <w:spacing w:before="242"/>
       </w:pPr>
       <w:r>
-        <w:t>No. The final result is data 4, science 3, the same as without a combiner</w:t>
+        <w:t xml:space="preserve">No. </w:t>
+      </w:r>
+      <w:proofErr w:type="gramStart"/>
+      <w:r>
+        <w:t>The final result</w:t>
+      </w:r>
+      <w:proofErr w:type="gramEnd"/>
+      <w:r>
+        <w:t xml:space="preserve"> is data 4, science 3, the same as without a combiner</w:t>
       </w:r>
     </w:p>
     <w:p>
@@ -14148,7 +14290,15 @@
         </w:tabs>
       </w:pPr>
       <w:r>
-        <w:t>Intermediate data is sent over the network from mappers to reducers. Fewer records means less data to send, so the transfer takes less time</w:t>
+        <w:t xml:space="preserve">Intermediate data is sent over the network from mappers to reducers. Fewer records </w:t>
+      </w:r>
+      <w:proofErr w:type="gramStart"/>
+      <w:r>
+        <w:t>means</w:t>
+      </w:r>
+      <w:proofErr w:type="gramEnd"/>
+      <w:r>
+        <w:t xml:space="preserve"> less data to send, so the transfer takes less time</w:t>
       </w:r>
     </w:p>
     <w:p>
@@ -14282,7 +14432,15 @@
         </w:tabs>
       </w:pPr>
       <w:r>
-        <w:t>Addition gives the same result in any order and grouping: (1 + 1 + 1) + 1 = 1 + 1 + 1 + 1. So adding partial sums first does not change the total</w:t>
+        <w:t xml:space="preserve">Addition gives the same result in any order and grouping: (1 + 1 + 1) + 1 = 1 + 1 + 1 + 1. </w:t>
+      </w:r>
+      <w:proofErr w:type="gramStart"/>
+      <w:r>
+        <w:t>So</w:t>
+      </w:r>
+      <w:proofErr w:type="gramEnd"/>
+      <w:r>
+        <w:t xml:space="preserve"> adding partial sums first does not change the total</w:t>
       </w:r>
     </w:p>
     <w:p>
@@ -14779,6 +14937,7 @@
                               </w:rPr>
                             </w:pPr>
                             <w:proofErr w:type="spellStart"/>
+                            <w:proofErr w:type="gramStart"/>
                             <w:r>
                               <w:rPr>
                                 <w:i/>
@@ -14804,6 +14963,7 @@
                               <w:t>k</w:t>
                             </w:r>
                             <w:proofErr w:type="spellEnd"/>
+                            <w:proofErr w:type="gramEnd"/>
                           </w:p>
                         </w:txbxContent>
                       </wps:txbx>
@@ -14830,6 +14990,7 @@
                         </w:rPr>
                       </w:pPr>
                       <w:proofErr w:type="spellStart"/>
+                      <w:proofErr w:type="gramStart"/>
                       <w:r>
                         <w:rPr>
                           <w:i/>
@@ -14855,6 +15016,7 @@
                         <w:t>k</w:t>
                       </w:r>
                       <w:proofErr w:type="spellEnd"/>
+                      <w:proofErr w:type="gramEnd"/>
                     </w:p>
                   </w:txbxContent>
                 </v:textbox>
@@ -15438,7 +15600,21 @@
         <w:rPr>
           <w:w w:val="105"/>
         </w:rPr>
-        <w:t>Can the same intermediate key be sent to two different reducers in a normal per-key reduc</w:t>
+        <w:t xml:space="preserve">Can the same intermediate key be sent to two different reducers </w:t>
+      </w:r>
+      <w:proofErr w:type="gramStart"/>
+      <w:r>
+        <w:rPr>
+          <w:w w:val="105"/>
+        </w:rPr>
+        <w:t>in</w:t>
+      </w:r>
+      <w:proofErr w:type="gramEnd"/>
+      <w:r>
+        <w:rPr>
+          <w:w w:val="105"/>
+        </w:rPr>
+        <w:t xml:space="preserve"> a normal per-key reduc</w:t>
       </w:r>
       <w:r>
         <w:rPr>
@@ -15812,6 +15988,7 @@
         </w:rPr>
         <w:t xml:space="preserve"> </w:t>
       </w:r>
+      <w:proofErr w:type="gramStart"/>
       <w:r>
         <w:rPr>
           <w:w w:val="105"/>
@@ -15844,6 +16021,7 @@
         </w:rPr>
         <w:t>same</w:t>
       </w:r>
+      <w:proofErr w:type="gramEnd"/>
       <w:r>
         <w:rPr>
           <w:spacing w:val="9"/>
@@ -16960,6 +17138,7 @@
         </w:rPr>
         <w:t xml:space="preserve"> </w:t>
       </w:r>
+      <w:proofErr w:type="gramStart"/>
       <w:r>
         <w:rPr>
           <w:w w:val="105"/>
@@ -16978,7 +17157,15 @@
           <w:spacing w:val="-5"/>
           <w:w w:val="105"/>
         </w:rPr>
-        <w:t>to:</w:t>
+        <w:t>to</w:t>
+      </w:r>
+      <w:proofErr w:type="gramEnd"/>
+      <w:r>
+        <w:rPr>
+          <w:spacing w:val="-5"/>
+          <w:w w:val="105"/>
+        </w:rPr>
+        <w:t>:</w:t>
       </w:r>
     </w:p>
     <w:p>
@@ -18673,9 +18860,11 @@
         </w:rPr>
         <w:t xml:space="preserve"> </w:t>
       </w:r>
+      <w:proofErr w:type="gramStart"/>
       <w:r>
         <w:t>reduce</w:t>
       </w:r>
+      <w:proofErr w:type="gramEnd"/>
       <w:r>
         <w:rPr>
           <w:spacing w:val="31"/>
@@ -18799,7 +18988,15 @@
         <w:spacing w:before="181"/>
       </w:pPr>
       <w:r>
-        <w:t>Mappers and reducers usually run on different machines, so intermediate data has to go over the network, which is much slower than reading from local memory or disk. With big input, the mappers can produce a lot of intermediate data</w:t>
+        <w:t xml:space="preserve">Mappers and reducers usually run on different machines, so intermediate data </w:t>
+      </w:r>
+      <w:proofErr w:type="gramStart"/>
+      <w:r>
+        <w:t>has to</w:t>
+      </w:r>
+      <w:proofErr w:type="gramEnd"/>
+      <w:r>
+        <w:t xml:space="preserve"> go over the network, which is much slower than reading from local memory or disk. With big input, the mappers can produce a lot of intermediate data</w:t>
       </w:r>
     </w:p>
     <w:p>
@@ -19149,6 +19346,18 @@
     </w:p>
     <w:p>
       <w:pPr>
+        <w:tabs>
+          <w:tab w:val="left" w:pos="999"/>
+        </w:tabs>
+        <w:spacing w:before="241" w:line="242" w:lineRule="auto"/>
+        <w:ind w:right="169"/>
+      </w:pPr>
+      <w:r>
+        <w:t>Moving a large input block over the network is slow. If the task runs on the machine that already stores the block, it reads the data from its local disk, and the network stays free</w:t>
+      </w:r>
+    </w:p>
+    <w:p>
+      <w:pPr>
         <w:pStyle w:val="a5"/>
         <w:numPr>
           <w:ilvl w:val="0"/>
@@ -19274,6 +19483,17 @@
     </w:p>
     <w:p>
       <w:pPr>
+        <w:tabs>
+          <w:tab w:val="left" w:pos="998"/>
+        </w:tabs>
+        <w:spacing w:before="179"/>
+      </w:pPr>
+      <w:r>
+        <w:t>Instead of sending big data to the program, the system sends the small program to the machines where the data is stored</w:t>
+      </w:r>
+    </w:p>
+    <w:p>
+      <w:pPr>
         <w:pStyle w:val="a5"/>
         <w:numPr>
           <w:ilvl w:val="0"/>
@@ -19450,6 +19670,16 @@
     </w:p>
     <w:p>
       <w:pPr>
+        <w:tabs>
+          <w:tab w:val="left" w:pos="998"/>
+        </w:tabs>
+      </w:pPr>
+      <w:r>
+        <w:t>It splits big files into blocks and stores them on many machines. Every machine can then read its own part of the data at the same time, and the data survives if one machine fails</w:t>
+      </w:r>
+    </w:p>
+    <w:p>
+      <w:pPr>
         <w:pStyle w:val="a5"/>
         <w:numPr>
           <w:ilvl w:val="0"/>
@@ -19570,13 +19800,41 @@
     </w:p>
     <w:p>
       <w:pPr>
-        <w:pStyle w:val="a5"/>
+        <w:tabs>
+          <w:tab w:val="left" w:pos="998"/>
+        </w:tabs>
+      </w:pPr>
+    </w:p>
+    <w:p>
+      <w:pPr>
+        <w:tabs>
+          <w:tab w:val="left" w:pos="998"/>
+        </w:tabs>
         <w:sectPr>
           <w:pgSz w:w="11910" w:h="16840"/>
           <w:pgMar w:top="1260" w:right="1133" w:bottom="860" w:left="850" w:header="0" w:footer="630" w:gutter="0"/>
           <w:cols w:space="720"/>
         </w:sectPr>
       </w:pPr>
+      <w:r>
+        <w:t xml:space="preserve">Stores the metadata: the list of files, which blocks each file has and on which </w:t>
+      </w:r>
+      <w:proofErr w:type="spellStart"/>
+      <w:r>
+        <w:t>DataNodes</w:t>
+      </w:r>
+      <w:proofErr w:type="spellEnd"/>
+      <w:r>
+        <w:t xml:space="preserve"> each block is stored. Clients ask the </w:t>
+      </w:r>
+      <w:proofErr w:type="spellStart"/>
+      <w:r>
+        <w:t>NameNode</w:t>
+      </w:r>
+      <w:proofErr w:type="spellEnd"/>
+      <w:r>
+        <w:t xml:space="preserve"> where the blocks are</w:t>
+      </w:r>
     </w:p>
     <w:p>
       <w:pPr>
@@ -19702,6 +19960,17 @@
     </w:p>
     <w:p>
       <w:pPr>
+        <w:tabs>
+          <w:tab w:val="left" w:pos="998"/>
+        </w:tabs>
+        <w:spacing w:before="36"/>
+      </w:pPr>
+      <w:r>
+        <w:t>Stores the actual file blocks on its local disk and sends them to clients when they read the file</w:t>
+      </w:r>
+    </w:p>
+    <w:p>
+      <w:pPr>
         <w:pStyle w:val="a5"/>
         <w:numPr>
           <w:ilvl w:val="0"/>
@@ -19844,6 +20113,36 @@
     </w:p>
     <w:p>
       <w:pPr>
+        <w:tabs>
+          <w:tab w:val="left" w:pos="999"/>
+        </w:tabs>
+        <w:spacing w:before="181" w:line="242" w:lineRule="auto"/>
+        <w:ind w:right="168"/>
+      </w:pPr>
+      <w:r>
+        <w:t xml:space="preserve">No. The </w:t>
+      </w:r>
+      <w:proofErr w:type="spellStart"/>
+      <w:r>
+        <w:t>NameNode</w:t>
+      </w:r>
+      <w:proofErr w:type="spellEnd"/>
+      <w:r>
+        <w:t xml:space="preserve"> only tells the client where the blocks are. The client then reads and writes the data directly with </w:t>
+      </w:r>
+      <w:proofErr w:type="gramStart"/>
+      <w:r>
+        <w:t xml:space="preserve">the </w:t>
+      </w:r>
+      <w:proofErr w:type="spellStart"/>
+      <w:r>
+        <w:t>DataNodes</w:t>
+      </w:r>
+      <w:proofErr w:type="spellEnd"/>
+      <w:proofErr w:type="gramEnd"/>
+    </w:p>
+    <w:p>
+      <w:pPr>
         <w:pStyle w:val="a5"/>
         <w:numPr>
           <w:ilvl w:val="0"/>
@@ -19956,6 +20255,17 @@
     </w:p>
     <w:p>
       <w:pPr>
+        <w:tabs>
+          <w:tab w:val="left" w:pos="998"/>
+        </w:tabs>
+        <w:spacing w:before="179"/>
+      </w:pPr>
+      <w:r>
+        <w:t>Machines fail often in a big cluster. With copies on several machines, a block is not lost when one machine breaks</w:t>
+      </w:r>
+    </w:p>
+    <w:p>
+      <w:pPr>
         <w:pStyle w:val="a5"/>
         <w:numPr>
           <w:ilvl w:val="0"/>
@@ -20037,6 +20347,37 @@
           <w:w w:val="105"/>
         </w:rPr>
         <w:t>tolerance?</w:t>
+      </w:r>
+    </w:p>
+    <w:p>
+      <w:pPr>
+        <w:tabs>
+          <w:tab w:val="left" w:pos="998"/>
+        </w:tabs>
+      </w:pPr>
+      <w:r>
+        <w:t xml:space="preserve">If </w:t>
+      </w:r>
+      <w:proofErr w:type="gramStart"/>
+      <w:r>
+        <w:t xml:space="preserve">a </w:t>
+      </w:r>
+      <w:proofErr w:type="spellStart"/>
+      <w:r>
+        <w:t>DataNode</w:t>
+      </w:r>
+      <w:proofErr w:type="spellEnd"/>
+      <w:proofErr w:type="gramEnd"/>
+      <w:r>
+        <w:t xml:space="preserve"> fails, the data is read from another copy and tasks continue. The </w:t>
+      </w:r>
+      <w:proofErr w:type="spellStart"/>
+      <w:r>
+        <w:t>NameNode</w:t>
+      </w:r>
+      <w:proofErr w:type="spellEnd"/>
+      <w:r>
+        <w:t xml:space="preserve"> then makes a new copy on another machine to bring back the normal number of copies</w:t>
       </w:r>
     </w:p>
     <w:p>
@@ -21352,7 +21693,7 @@
           </mc:Choice>
           <mc:Fallback>
             <w:pict>
-              <v:shape w14:anchorId="0F186DF7" id="Graphic 40" o:spid="_x0000_s1026" style="position:absolute;margin-left:121.8pt;margin-top:19.4pt;width:3.45pt;height:.1pt;z-index:-15977472;visibility:visible;mso-wrap-style:square;mso-wrap-distance-left:0;mso-wrap-distance-top:0;mso-wrap-distance-right:0;mso-wrap-distance-bottom:0;mso-position-horizontal:absolute;mso-position-horizontal-relative:page;mso-position-vertical:absolute;mso-position-vertical-relative:text;v-text-anchor:top" coordsize="43815,1270" o:gfxdata="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" path="m,l43637,e" filled="f" strokeweight=".14039mm">
+              <v:shape w14:anchorId="40F67706" id="Graphic 40" o:spid="_x0000_s1026" style="position:absolute;margin-left:121.8pt;margin-top:19.4pt;width:3.45pt;height:.1pt;z-index:-15977472;visibility:visible;mso-wrap-style:square;mso-wrap-distance-left:0;mso-wrap-distance-top:0;mso-wrap-distance-right:0;mso-wrap-distance-bottom:0;mso-position-horizontal:absolute;mso-position-horizontal-relative:page;mso-position-vertical:absolute;mso-position-vertical-relative:text;v-text-anchor:top" coordsize="43815,1270" o:gfxdata="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" path="m,l43637,e" filled="f" strokeweight=".14039mm">
                 <v:path arrowok="t"/>
                 <w10:wrap anchorx="page"/>
               </v:shape>
@@ -21466,7 +21807,7 @@
           </mc:Choice>
           <mc:Fallback>
             <w:pict>
-              <v:shape w14:anchorId="408549B3" id="Graphic 41" o:spid="_x0000_s1026" style="position:absolute;margin-left:121.8pt;margin-top:19.35pt;width:3.45pt;height:.1pt;z-index:-15976960;visibility:visible;mso-wrap-style:square;mso-wrap-distance-left:0;mso-wrap-distance-top:0;mso-wrap-distance-right:0;mso-wrap-distance-bottom:0;mso-position-horizontal:absolute;mso-position-horizontal-relative:page;mso-position-vertical:absolute;mso-position-vertical-relative:text;v-text-anchor:top" coordsize="43815,1270" o:gfxdata="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" path="m,l43637,e" filled="f" strokeweight=".14039mm">
+              <v:shape w14:anchorId="0C569842" id="Graphic 41" o:spid="_x0000_s1026" style="position:absolute;margin-left:121.8pt;margin-top:19.35pt;width:3.45pt;height:.1pt;z-index:-15976960;visibility:visible;mso-wrap-style:square;mso-wrap-distance-left:0;mso-wrap-distance-top:0;mso-wrap-distance-right:0;mso-wrap-distance-bottom:0;mso-position-horizontal:absolute;mso-position-horizontal-relative:page;mso-position-vertical:absolute;mso-position-vertical-relative:text;v-text-anchor:top" coordsize="43815,1270" o:gfxdata="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" path="m,l43637,e" filled="f" strokeweight=".14039mm">
                 <v:path arrowok="t"/>
                 <w10:wrap anchorx="page"/>
               </v:shape>
@@ -21719,6 +22060,7 @@
         <w:jc w:val="left"/>
       </w:pPr>
       <w:r>
+        <w:lastRenderedPageBreak/>
         <w:t>answers</w:t>
       </w:r>
       <w:r>

</xml_diff>